<commit_message>
Deploying to gh-pages from @ j1yoo/j1yoo.github.io@301d98678a29487c80e62e180acbed61d7c6a3ef 🚀
</commit_message>
<xml_diff>
--- a/assets/courses/eci/Spring 2026_Syllabus_ECI.docx
+++ b/assets/courses/eci/Spring 2026_Syllabus_ECI.docx
@@ -255,53 +255,7 @@
                 <w:sz w:val="18"/>
                 <w:szCs w:val="18"/>
               </w:rPr>
-              <w:t>Feb 202</w:t>
-            </w:r>
-            <w:r>
-              <w:rPr>
-                <w:rFonts w:ascii="Georgia" w:eastAsia="Georgia" w:hAnsi="Georgia" w:cs="Georgia"/>
-                <w:color w:val="000000"/>
-                <w:sz w:val="18"/>
-                <w:szCs w:val="18"/>
-              </w:rPr>
-              <w:t>6</w:t>
-            </w:r>
-            <w:r>
-              <w:rPr>
-                <w:rFonts w:ascii="Georgia" w:eastAsia="Georgia" w:hAnsi="Georgia" w:cs="Georgia"/>
-                <w:color w:val="000000"/>
-                <w:sz w:val="18"/>
-                <w:szCs w:val="18"/>
-              </w:rPr>
-              <w:t xml:space="preserve"> </w:t>
-            </w:r>
-            <w:r>
-              <w:rPr>
-                <w:rFonts w:ascii="Georgia" w:eastAsia="Georgia" w:hAnsi="Georgia" w:cs="Georgia"/>
-                <w:i/>
-                <w:color w:val="000000"/>
-                <w:sz w:val="18"/>
-                <w:szCs w:val="18"/>
-              </w:rPr>
-              <w:t>–</w:t>
-            </w:r>
-            <w:r>
-              <w:rPr>
-                <w:rFonts w:ascii="Georgia" w:eastAsia="Georgia" w:hAnsi="Georgia" w:cs="Georgia"/>
-                <w:color w:val="000000"/>
-                <w:sz w:val="18"/>
-                <w:szCs w:val="18"/>
-              </w:rPr>
-              <w:t xml:space="preserve"> Jul 202</w:t>
-            </w:r>
-            <w:r>
-              <w:rPr>
-                <w:rFonts w:ascii="Georgia" w:eastAsia="Georgia" w:hAnsi="Georgia" w:cs="Georgia"/>
-                <w:color w:val="000000"/>
-                <w:sz w:val="18"/>
-                <w:szCs w:val="18"/>
-              </w:rPr>
-              <w:t>6</w:t>
+              <w:t>Feb 23 – Jun 15, 2026</w:t>
             </w:r>
           </w:p>
         </w:tc>
@@ -558,7 +512,7 @@
           <w:sz w:val="23"/>
           <w:szCs w:val="23"/>
         </w:rPr>
-        <w:t xml:space="preserve"> experimental methods for causal inference that are widely used in a broad array of </w:t>
+        <w:t xml:space="preserve"> experimental and quasi-experimental methods for causal inference that are widely used in a broad array of </w:t>
       </w:r>
       <w:r>
         <w:rPr>
@@ -1295,32 +1249,152 @@
     </w:p>
     <w:p>
       <w:pPr>
-        <w:rPr>
-          <w:rFonts w:ascii="Garamond" w:eastAsia="Garamond" w:hAnsi="Garamond" w:cs="Garamond"/>
-        </w:rPr>
-      </w:pPr>
+        <w:numPr>
+          <w:ilvl w:val="0"/>
+          <w:numId w:val="7"/>
+        </w:numPr>
+        <w:rPr>
+          <w:rFonts w:ascii="Garamond" w:eastAsia="Garamond" w:hAnsi="Garamond" w:cs="Garamond"/>
+        </w:rPr>
+      </w:pPr>
+      <w:r>
+        <w:rPr>
+          <w:rFonts w:ascii="Garamond" w:hAnsi="Garamond"/>
+          <w:b/>
+          <w:sz w:val="23"/>
+        </w:rPr>
+        <w:t>Recommended prior coursework:</w:t>
+      </w:r>
     </w:p>
     <w:p>
       <w:pPr>
-        <w:rPr>
-          <w:rFonts w:ascii="Garamond" w:eastAsia="Garamond" w:hAnsi="Garamond" w:cs="Garamond"/>
-          <w:b/>
-          <w:sz w:val="23"/>
-          <w:szCs w:val="23"/>
-        </w:rPr>
-      </w:pPr>
-      <w:r>
-        <w:rPr>
-          <w:rFonts w:ascii="Garamond" w:eastAsia="Garamond" w:hAnsi="Garamond" w:cs="Garamond"/>
-          <w:b/>
-          <w:sz w:val="23"/>
-          <w:szCs w:val="23"/>
-        </w:rPr>
-        <w:t>TEXTBOOK:</w:t>
+        <w:numPr>
+          <w:ilvl w:val="1"/>
+          <w:numId w:val="7"/>
+        </w:numPr>
+        <w:rPr>
+          <w:rFonts w:ascii="Garamond" w:eastAsia="Garamond" w:hAnsi="Garamond" w:cs="Garamond"/>
+        </w:rPr>
+      </w:pPr>
+      <w:r>
+        <w:rPr>
+          <w:rFonts w:ascii="Garamond" w:hAnsi="Garamond"/>
+          <w:sz w:val="23"/>
+        </w:rPr>
+        <w:t>ISS5077 Computational Statistics for Data Science (CSDS) covers hypothesis testing, regression, and applied statistical modeling; ideal preparation for this course.</w:t>
       </w:r>
     </w:p>
     <w:p>
       <w:pPr>
+        <w:numPr>
+          <w:ilvl w:val="1"/>
+          <w:numId w:val="7"/>
+        </w:numPr>
+        <w:rPr>
+          <w:rFonts w:ascii="Garamond" w:eastAsia="Garamond" w:hAnsi="Garamond" w:cs="Garamond"/>
+        </w:rPr>
+      </w:pPr>
+      <w:r>
+        <w:rPr>
+          <w:rFonts w:ascii="Garamond" w:hAnsi="Garamond"/>
+          <w:sz w:val="23"/>
+        </w:rPr>
+        <w:lastRenderedPageBreak/>
+        <w:t>ECON3033 Econometrics I and ECON3034 Econometrics II — regression methodology and empirical research designs.</w:t>
+      </w:r>
+    </w:p>
+    <w:p>
+      <w:pPr>
+        <w:numPr>
+          <w:ilvl w:val="1"/>
+          <w:numId w:val="7"/>
+        </w:numPr>
+        <w:rPr>
+          <w:rFonts w:ascii="Garamond" w:eastAsia="Garamond" w:hAnsi="Garamond" w:cs="Garamond"/>
+        </w:rPr>
+      </w:pPr>
+      <w:r>
+        <w:rPr>
+          <w:rFonts w:ascii="Garamond" w:hAnsi="Garamond"/>
+          <w:sz w:val="23"/>
+        </w:rPr>
+        <w:t>ISS5066 Programming for Business Analytics (PBA) covers regression, statistical inference, and R programming, but students entering with PBA alone should expect a steeper learning curve.</w:t>
+      </w:r>
+    </w:p>
+    <w:p>
+      <w:pPr>
+        <w:numPr>
+          <w:ilvl w:val="1"/>
+          <w:numId w:val="7"/>
+        </w:numPr>
+        <w:rPr>
+          <w:rFonts w:ascii="Garamond" w:eastAsia="Garamond" w:hAnsi="Garamond" w:cs="Garamond"/>
+        </w:rPr>
+      </w:pPr>
+      <w:r>
+        <w:rPr>
+          <w:rFonts w:ascii="Garamond" w:hAnsi="Garamond"/>
+          <w:sz w:val="23"/>
+        </w:rPr>
+        <w:t>ISS5090 Business Analytics with Machine Learning (BAML) relevant background for the causal ML topics covered in Weeks 14–15.</w:t>
+      </w:r>
+    </w:p>
+    <w:p>
+      <w:pPr>
+        <w:ind w:left="720"/>
+        <w:rPr>
+          <w:rFonts w:ascii="Batang" w:eastAsia="Batang" w:hAnsi="Batang" w:cs="Batang" w:hint="eastAsia"/>
+          <w:i/>
+          <w:lang w:eastAsia="ko-KR"/>
+        </w:rPr>
+      </w:pPr>
+      <w:r>
+        <w:rPr>
+          <w:rFonts w:ascii="Garamond" w:hAnsi="Garamond"/>
+          <w:iCs/>
+          <w:sz w:val="6"/>
+          <w:szCs w:val="6"/>
+          <w:lang w:eastAsia="ko-KR"/>
+        </w:rPr>
+        <w:br/>
+      </w:r>
+      <w:r>
+        <w:rPr>
+          <w:rFonts w:ascii="Garamond" w:hAnsi="Garamond"/>
+          <w:i/>
+          <w:sz w:val="23"/>
+        </w:rPr>
+        <w:t>Students may also be interested in ECON5099 Causal Inference in Econometrics, which covers related topics.</w:t>
+      </w:r>
+    </w:p>
+    <w:p>
+      <w:pPr>
+        <w:rPr>
+          <w:rFonts w:ascii="Garamond" w:eastAsia="Garamond" w:hAnsi="Garamond" w:cs="Garamond"/>
+        </w:rPr>
+      </w:pPr>
+    </w:p>
+    <w:p>
+      <w:pPr>
+        <w:rPr>
+          <w:rFonts w:ascii="Garamond" w:eastAsia="Garamond" w:hAnsi="Garamond" w:cs="Garamond"/>
+          <w:b/>
+          <w:sz w:val="23"/>
+          <w:szCs w:val="23"/>
+        </w:rPr>
+      </w:pPr>
+      <w:r>
+        <w:rPr>
+          <w:rFonts w:ascii="Garamond" w:eastAsia="Garamond" w:hAnsi="Garamond" w:cs="Garamond"/>
+          <w:b/>
+          <w:sz w:val="23"/>
+          <w:szCs w:val="23"/>
+        </w:rPr>
+        <w:t>TEXTBOOK:</w:t>
+      </w:r>
+    </w:p>
+    <w:p>
+      <w:pPr>
         <w:jc w:val="both"/>
         <w:rPr>
           <w:rFonts w:ascii="Garamond" w:eastAsia="Garamond" w:hAnsi="Garamond" w:cs="Garamond"/>
@@ -1345,17 +1419,7 @@
           <w:sz w:val="23"/>
           <w:szCs w:val="23"/>
         </w:rPr>
-        <w:t xml:space="preserve">If you choose to order </w:t>
-      </w:r>
-      <w:r>
-        <w:rPr>
-          <w:rFonts w:ascii="Garamond" w:eastAsia="Garamond" w:hAnsi="Garamond" w:cs="Garamond"/>
-          <w:color w:val="000000"/>
-          <w:sz w:val="23"/>
-          <w:szCs w:val="23"/>
-        </w:rPr>
-        <w:lastRenderedPageBreak/>
-        <w:t>online, b</w:t>
+        <w:t>If you choose to order online, b</w:t>
       </w:r>
       <w:r>
         <w:rPr>
@@ -2567,6 +2631,7 @@
     </w:p>
     <w:p>
       <w:pPr>
+        <w:spacing w:before="240"/>
         <w:rPr>
           <w:rFonts w:ascii="Garamond" w:eastAsia="Garamond" w:hAnsi="Garamond" w:cs="Garamond"/>
           <w:color w:val="000000"/>
@@ -2576,6 +2641,221 @@
     </w:p>
     <w:p>
       <w:pPr>
+        <w:spacing w:before="240" w:line="480" w:lineRule="auto"/>
+        <w:rPr>
+          <w:rFonts w:ascii="Garamond" w:eastAsia="Garamond" w:hAnsi="Garamond" w:cs="Garamond"/>
+          <w:b/>
+          <w:color w:val="000000"/>
+          <w:sz w:val="23"/>
+          <w:szCs w:val="23"/>
+        </w:rPr>
+      </w:pPr>
+      <w:r>
+        <w:rPr>
+          <w:rFonts w:ascii="Garamond" w:hAnsi="Garamond"/>
+          <w:b/>
+          <w:sz w:val="23"/>
+        </w:rPr>
+        <w:lastRenderedPageBreak/>
+        <w:t>SOFTWARE:</w:t>
+      </w:r>
+    </w:p>
+    <w:p>
+      <w:pPr>
+        <w:rPr>
+          <w:rFonts w:ascii="Garamond" w:eastAsia="Garamond" w:hAnsi="Garamond" w:cs="Garamond"/>
+          <w:b/>
+          <w:color w:val="000000"/>
+          <w:sz w:val="23"/>
+          <w:szCs w:val="23"/>
+        </w:rPr>
+      </w:pPr>
+      <w:r>
+        <w:rPr>
+          <w:rFonts w:ascii="Garamond" w:hAnsi="Garamond"/>
+          <w:sz w:val="23"/>
+        </w:rPr>
+        <w:t xml:space="preserve">We use R (with RStudio) as the primary computing environment. Key packages include: </w:t>
+      </w:r>
+      <w:r>
+        <w:rPr>
+          <w:rFonts w:ascii="Lucida Console" w:hAnsi="Lucida Console"/>
+          <w:sz w:val="18"/>
+          <w:szCs w:val="18"/>
+        </w:rPr>
+        <w:t>tidyverse</w:t>
+      </w:r>
+      <w:r>
+        <w:rPr>
+          <w:rFonts w:ascii="Garamond" w:hAnsi="Garamond"/>
+          <w:sz w:val="23"/>
+        </w:rPr>
+        <w:t xml:space="preserve">, </w:t>
+      </w:r>
+      <w:r>
+        <w:rPr>
+          <w:rFonts w:ascii="Lucida Console" w:hAnsi="Lucida Console"/>
+          <w:sz w:val="18"/>
+          <w:szCs w:val="18"/>
+        </w:rPr>
+        <w:t>fixest</w:t>
+      </w:r>
+      <w:r>
+        <w:rPr>
+          <w:rFonts w:ascii="Garamond" w:hAnsi="Garamond"/>
+          <w:sz w:val="23"/>
+        </w:rPr>
+        <w:t xml:space="preserve">, </w:t>
+      </w:r>
+      <w:r>
+        <w:rPr>
+          <w:rFonts w:ascii="Lucida Console" w:hAnsi="Lucida Console"/>
+          <w:sz w:val="18"/>
+          <w:szCs w:val="18"/>
+        </w:rPr>
+        <w:t>did</w:t>
+      </w:r>
+      <w:r>
+        <w:rPr>
+          <w:rFonts w:ascii="Garamond" w:hAnsi="Garamond"/>
+          <w:sz w:val="23"/>
+        </w:rPr>
+        <w:t xml:space="preserve">, </w:t>
+      </w:r>
+      <w:r>
+        <w:rPr>
+          <w:rFonts w:ascii="Lucida Console" w:hAnsi="Lucida Console"/>
+          <w:sz w:val="18"/>
+          <w:szCs w:val="18"/>
+        </w:rPr>
+        <w:t>rdrobust</w:t>
+      </w:r>
+      <w:r>
+        <w:rPr>
+          <w:rFonts w:ascii="Garamond" w:hAnsi="Garamond"/>
+          <w:sz w:val="23"/>
+        </w:rPr>
+        <w:t xml:space="preserve">, </w:t>
+      </w:r>
+      <w:r>
+        <w:rPr>
+          <w:rFonts w:ascii="Lucida Console" w:hAnsi="Lucida Console"/>
+          <w:sz w:val="18"/>
+          <w:szCs w:val="18"/>
+        </w:rPr>
+        <w:t>MatchIt</w:t>
+      </w:r>
+      <w:r>
+        <w:rPr>
+          <w:rFonts w:ascii="Garamond" w:hAnsi="Garamond"/>
+          <w:sz w:val="23"/>
+        </w:rPr>
+        <w:t xml:space="preserve">, </w:t>
+      </w:r>
+      <w:r>
+        <w:rPr>
+          <w:rFonts w:ascii="Lucida Console" w:hAnsi="Lucida Console"/>
+          <w:sz w:val="18"/>
+          <w:szCs w:val="18"/>
+        </w:rPr>
+        <w:t>WeightIt</w:t>
+      </w:r>
+      <w:r>
+        <w:rPr>
+          <w:rFonts w:ascii="Garamond" w:hAnsi="Garamond"/>
+          <w:sz w:val="23"/>
+        </w:rPr>
+        <w:t xml:space="preserve">, </w:t>
+      </w:r>
+      <w:proofErr w:type="spellStart"/>
+      <w:r>
+        <w:rPr>
+          <w:rFonts w:ascii="Lucida Console" w:hAnsi="Lucida Console"/>
+          <w:sz w:val="18"/>
+          <w:szCs w:val="18"/>
+        </w:rPr>
+        <w:t>grf</w:t>
+      </w:r>
+      <w:proofErr w:type="spellEnd"/>
+      <w:r>
+        <w:rPr>
+          <w:rFonts w:ascii="Garamond" w:hAnsi="Garamond"/>
+          <w:sz w:val="23"/>
+        </w:rPr>
+        <w:t xml:space="preserve">, </w:t>
+      </w:r>
+      <w:proofErr w:type="spellStart"/>
+      <w:r>
+        <w:rPr>
+          <w:rFonts w:ascii="Lucida Console" w:hAnsi="Lucida Console"/>
+          <w:sz w:val="18"/>
+          <w:szCs w:val="18"/>
+        </w:rPr>
+        <w:t>dagitty</w:t>
+      </w:r>
+      <w:proofErr w:type="spellEnd"/>
+      <w:r>
+        <w:rPr>
+          <w:rFonts w:ascii="Garamond" w:hAnsi="Garamond"/>
+          <w:sz w:val="23"/>
+        </w:rPr>
+        <w:t xml:space="preserve">, </w:t>
+      </w:r>
+      <w:proofErr w:type="spellStart"/>
+      <w:r>
+        <w:rPr>
+          <w:rFonts w:ascii="Lucida Console" w:hAnsi="Lucida Console"/>
+          <w:sz w:val="18"/>
+          <w:szCs w:val="18"/>
+        </w:rPr>
+        <w:t>ggdag</w:t>
+      </w:r>
+      <w:proofErr w:type="spellEnd"/>
+      <w:r>
+        <w:rPr>
+          <w:rFonts w:ascii="Garamond" w:hAnsi="Garamond"/>
+          <w:sz w:val="23"/>
+        </w:rPr>
+        <w:t xml:space="preserve">, </w:t>
+      </w:r>
+      <w:proofErr w:type="spellStart"/>
+      <w:r>
+        <w:rPr>
+          <w:rFonts w:ascii="Lucida Console" w:hAnsi="Lucida Console"/>
+          <w:sz w:val="18"/>
+          <w:szCs w:val="18"/>
+        </w:rPr>
+        <w:t>modelsummary</w:t>
+      </w:r>
+      <w:proofErr w:type="spellEnd"/>
+      <w:r>
+        <w:rPr>
+          <w:rFonts w:ascii="Garamond" w:hAnsi="Garamond"/>
+          <w:sz w:val="23"/>
+        </w:rPr>
+        <w:t>.</w:t>
+      </w:r>
+      <w:r>
+        <w:rPr>
+          <w:rFonts w:ascii="Garamond" w:eastAsia="Garamond" w:hAnsi="Garamond" w:cs="Garamond"/>
+          <w:b/>
+          <w:color w:val="000000"/>
+          <w:sz w:val="23"/>
+          <w:szCs w:val="23"/>
+        </w:rPr>
+        <w:t xml:space="preserve"> </w:t>
+      </w:r>
+      <w:r>
+        <w:rPr>
+          <w:rFonts w:ascii="Garamond" w:hAnsi="Garamond"/>
+          <w:sz w:val="23"/>
+        </w:rPr>
+        <w:t>Students comfortable with Stata or Python may use those for their research projects, but in-class demonstrations and code examples will be in R.</w:t>
+      </w:r>
+    </w:p>
+    <w:p>
+      <w:pPr>
+        <w:spacing w:before="240"/>
         <w:rPr>
           <w:rFonts w:ascii="Garamond" w:eastAsia="Garamond" w:hAnsi="Garamond" w:cs="Garamond"/>
           <w:b/>
@@ -2698,25 +2978,7 @@
                 <w:sz w:val="23"/>
                 <w:szCs w:val="23"/>
               </w:rPr>
-              <w:t>The Effect</w:t>
-            </w:r>
-            <w:r>
-              <w:rPr>
-                <w:rFonts w:ascii="Garamond" w:eastAsia="Garamond" w:hAnsi="Garamond" w:cs="Garamond"/>
-                <w:i/>
-                <w:iCs/>
-                <w:sz w:val="23"/>
-                <w:szCs w:val="23"/>
-              </w:rPr>
-              <w:t xml:space="preserve"> </w:t>
-            </w:r>
-            <w:r>
-              <w:rPr>
-                <w:rFonts w:ascii="Garamond" w:eastAsia="Garamond" w:hAnsi="Garamond" w:cs="Garamond"/>
-                <w:sz w:val="23"/>
-                <w:szCs w:val="23"/>
-              </w:rPr>
-              <w:t xml:space="preserve"> assignments</w:t>
+              <w:t>Research Project</w:t>
             </w:r>
           </w:p>
         </w:tc>
@@ -2759,23 +3021,7 @@
                 <w:sz w:val="23"/>
                 <w:szCs w:val="23"/>
               </w:rPr>
-              <w:t>2</w:t>
-            </w:r>
-            <w:r>
-              <w:rPr>
-                <w:rFonts w:ascii="Garamond" w:eastAsia="Garamond" w:hAnsi="Garamond" w:cs="Garamond"/>
-                <w:sz w:val="23"/>
-                <w:szCs w:val="23"/>
-              </w:rPr>
-              <w:t>5</w:t>
-            </w:r>
-            <w:r>
-              <w:rPr>
-                <w:rFonts w:ascii="Garamond" w:eastAsia="Garamond" w:hAnsi="Garamond" w:cs="Garamond"/>
-                <w:sz w:val="23"/>
-                <w:szCs w:val="23"/>
-              </w:rPr>
-              <w:t>%</w:t>
+              <w:t>50%</w:t>
             </w:r>
           </w:p>
         </w:tc>
@@ -2822,7 +3068,7 @@
                 <w:sz w:val="23"/>
                 <w:szCs w:val="23"/>
               </w:rPr>
-              <w:t>Problem sets</w:t>
+              <w:t>Problem Sets</w:t>
             </w:r>
           </w:p>
         </w:tc>
@@ -2865,7 +3111,7 @@
                 <w:sz w:val="23"/>
                 <w:szCs w:val="23"/>
               </w:rPr>
-              <w:t>20%</w:t>
+              <w:t>15%</w:t>
             </w:r>
           </w:p>
         </w:tc>
@@ -2913,7 +3159,7 @@
                 <w:sz w:val="23"/>
                 <w:szCs w:val="23"/>
               </w:rPr>
-              <w:t>Final research project</w:t>
+              <w:t>The Effect Assignments</w:t>
             </w:r>
           </w:p>
         </w:tc>
@@ -2956,15 +3202,7 @@
                 <w:sz w:val="23"/>
                 <w:szCs w:val="23"/>
               </w:rPr>
-              <w:t>35</w:t>
-            </w:r>
-            <w:r>
-              <w:rPr>
-                <w:rFonts w:ascii="Garamond" w:eastAsia="Garamond" w:hAnsi="Garamond" w:cs="Garamond"/>
-                <w:sz w:val="23"/>
-                <w:szCs w:val="23"/>
-              </w:rPr>
-              <w:t>%</w:t>
+              <w:t>15%</w:t>
             </w:r>
           </w:p>
         </w:tc>
@@ -3011,7 +3249,7 @@
                 <w:sz w:val="23"/>
                 <w:szCs w:val="23"/>
               </w:rPr>
-              <w:t>One-page summaries &amp; paper presentations (peer-reviewed)</w:t>
+              <w:t>Participation (incl. presentations)</w:t>
             </w:r>
           </w:p>
         </w:tc>
@@ -3101,7 +3339,7 @@
                 <w:sz w:val="23"/>
                 <w:szCs w:val="23"/>
               </w:rPr>
-              <w:t>Attitude/Participation</w:t>
+              <w:t>One-Page Summaries</w:t>
             </w:r>
           </w:p>
         </w:tc>
@@ -3144,7 +3382,7 @@
                 <w:sz w:val="23"/>
                 <w:szCs w:val="23"/>
               </w:rPr>
-              <w:t xml:space="preserve"> 5%</w:t>
+              <w:t>5%</w:t>
             </w:r>
           </w:p>
         </w:tc>
@@ -3191,7 +3429,6 @@
                 <w:sz w:val="23"/>
                 <w:szCs w:val="23"/>
               </w:rPr>
-              <w:lastRenderedPageBreak/>
               <w:t>Attendance</w:t>
             </w:r>
           </w:p>
@@ -3235,7 +3472,7 @@
                 <w:sz w:val="23"/>
                 <w:szCs w:val="23"/>
               </w:rPr>
-              <w:t xml:space="preserve"> 5%</w:t>
+              <w:t>5%</w:t>
             </w:r>
           </w:p>
         </w:tc>
@@ -3470,7 +3707,7 @@
           <w:sz w:val="23"/>
           <w:szCs w:val="23"/>
         </w:rPr>
-        <w:t xml:space="preserve"> e.g., ChatGPT, Claude 2, Bard</w:t>
+        <w:t xml:space="preserve"> e.g., ChatGPT, Claude, Gemini</w:t>
       </w:r>
       <w:r>
         <w:rPr>
@@ -3729,7 +3966,16 @@
           <w:sz w:val="23"/>
           <w:szCs w:val="23"/>
         </w:rPr>
-        <w:t xml:space="preserve">All work submitted for academic evaluation must be the student’s own. The penalty for violation of academic integrity will result in a zero for that assignment for the first time. Subsequent </w:t>
+        <w:t xml:space="preserve">All work submitted for academic evaluation must be the student’s own. The penalty for violation of academic integrity will result in a zero for that </w:t>
+      </w:r>
+      <w:r>
+        <w:rPr>
+          <w:rFonts w:ascii="Garamond" w:eastAsia="Garamond" w:hAnsi="Garamond" w:cs="Garamond"/>
+          <w:sz w:val="23"/>
+          <w:szCs w:val="23"/>
+        </w:rPr>
+        <w:lastRenderedPageBreak/>
+        <w:t xml:space="preserve">assignment for the first time. Subsequent </w:t>
       </w:r>
       <w:r>
         <w:rPr>
@@ -4257,16 +4503,7 @@
           <w:sz w:val="23"/>
           <w:szCs w:val="23"/>
         </w:rPr>
-        <w:t xml:space="preserve">course materials, which will be distributed by the instructor before class. If you have any urgent reason to miss a class, you are still responsible for the materials covered during the class and are expected to complete the required work. Attendance will be taken on a regular basis and will count </w:t>
-      </w:r>
-      <w:r>
-        <w:rPr>
-          <w:rFonts w:ascii="Garamond" w:eastAsia="Garamond" w:hAnsi="Garamond" w:cs="Garamond"/>
-          <w:sz w:val="23"/>
-          <w:szCs w:val="23"/>
-        </w:rPr>
-        <w:lastRenderedPageBreak/>
-        <w:t>towards your participation score (</w:t>
+        <w:t>course materials, which will be distributed by the instructor before class. If you have any urgent reason to miss a class, you are still responsible for the materials covered during the class and are expected to complete the required work. Attendance will be taken on a regular basis and will count towards your participation score (</w:t>
       </w:r>
       <w:r>
         <w:rPr>
@@ -4612,6 +4849,267 @@
       </w:pPr>
       <w:r>
         <w:rPr>
+          <w:rFonts w:ascii="Garamond" w:hAnsi="Garamond"/>
+          <w:b/>
+          <w:sz w:val="23"/>
+        </w:rPr>
+        <w:t>One-Page Summary Guideline:</w:t>
+      </w:r>
+    </w:p>
+    <w:p>
+      <w:pPr>
+        <w:pStyle w:val="ListParagraph"/>
+        <w:numPr>
+          <w:ilvl w:val="2"/>
+          <w:numId w:val="2"/>
+        </w:numPr>
+        <w:jc w:val="both"/>
+        <w:rPr>
+          <w:rFonts w:ascii="Garamond" w:eastAsia="Garamond" w:hAnsi="Garamond" w:cs="Garamond"/>
+          <w:sz w:val="23"/>
+          <w:szCs w:val="23"/>
+          <w:lang w:eastAsia="zh-CN"/>
+        </w:rPr>
+      </w:pPr>
+      <w:r>
+        <w:rPr>
+          <w:rFonts w:ascii="Garamond" w:hAnsi="Garamond"/>
+          <w:sz w:val="23"/>
+        </w:rPr>
+        <w:t>Choose 5 papers from the assigned reading list and write a one-page summary addressing the following:</w:t>
+      </w:r>
+    </w:p>
+    <w:p>
+      <w:pPr>
+        <w:pStyle w:val="ListParagraph"/>
+        <w:numPr>
+          <w:ilvl w:val="3"/>
+          <w:numId w:val="43"/>
+        </w:numPr>
+        <w:ind w:left="2520"/>
+        <w:jc w:val="both"/>
+        <w:rPr>
+          <w:rFonts w:ascii="Garamond" w:eastAsia="Garamond" w:hAnsi="Garamond" w:cs="Garamond"/>
+          <w:sz w:val="23"/>
+          <w:szCs w:val="23"/>
+          <w:lang w:eastAsia="zh-CN"/>
+        </w:rPr>
+      </w:pPr>
+      <w:r>
+        <w:rPr>
+          <w:rFonts w:ascii="Garamond" w:hAnsi="Garamond"/>
+          <w:sz w:val="23"/>
+        </w:rPr>
+        <w:t>Main Question</w:t>
+      </w:r>
+      <w:r>
+        <w:rPr>
+          <w:rFonts w:ascii="Garamond" w:hAnsi="Garamond"/>
+          <w:sz w:val="23"/>
+        </w:rPr>
+        <w:t>:</w:t>
+      </w:r>
+      <w:r>
+        <w:rPr>
+          <w:rFonts w:ascii="Garamond" w:hAnsi="Garamond"/>
+          <w:sz w:val="23"/>
+        </w:rPr>
+        <w:t xml:space="preserve"> What is the main question of the paper? Why do we care?</w:t>
+      </w:r>
+    </w:p>
+    <w:p>
+      <w:pPr>
+        <w:pStyle w:val="ListParagraph"/>
+        <w:numPr>
+          <w:ilvl w:val="3"/>
+          <w:numId w:val="43"/>
+        </w:numPr>
+        <w:ind w:left="2520"/>
+        <w:jc w:val="both"/>
+        <w:rPr>
+          <w:rFonts w:ascii="Garamond" w:eastAsia="Garamond" w:hAnsi="Garamond" w:cs="Garamond"/>
+          <w:sz w:val="23"/>
+          <w:szCs w:val="23"/>
+          <w:lang w:eastAsia="zh-CN"/>
+        </w:rPr>
+      </w:pPr>
+      <w:r>
+        <w:rPr>
+          <w:rFonts w:ascii="Garamond" w:hAnsi="Garamond"/>
+          <w:sz w:val="23"/>
+        </w:rPr>
+        <w:lastRenderedPageBreak/>
+        <w:t>Parameters of Interest</w:t>
+      </w:r>
+      <w:r>
+        <w:rPr>
+          <w:rFonts w:ascii="Garamond" w:hAnsi="Garamond"/>
+          <w:sz w:val="23"/>
+        </w:rPr>
+        <w:t>:</w:t>
+      </w:r>
+      <w:r>
+        <w:rPr>
+          <w:rFonts w:ascii="Garamond" w:hAnsi="Garamond"/>
+          <w:sz w:val="23"/>
+        </w:rPr>
+        <w:t xml:space="preserve"> What model aspects or facts are being estimated?</w:t>
+      </w:r>
+    </w:p>
+    <w:p>
+      <w:pPr>
+        <w:pStyle w:val="ListParagraph"/>
+        <w:numPr>
+          <w:ilvl w:val="3"/>
+          <w:numId w:val="43"/>
+        </w:numPr>
+        <w:ind w:left="2520"/>
+        <w:jc w:val="both"/>
+        <w:rPr>
+          <w:rFonts w:ascii="Garamond" w:eastAsia="Garamond" w:hAnsi="Garamond" w:cs="Garamond"/>
+          <w:sz w:val="23"/>
+          <w:szCs w:val="23"/>
+          <w:lang w:eastAsia="zh-CN"/>
+        </w:rPr>
+      </w:pPr>
+      <w:r>
+        <w:rPr>
+          <w:rFonts w:ascii="Garamond" w:hAnsi="Garamond"/>
+          <w:sz w:val="23"/>
+        </w:rPr>
+        <w:t>Data</w:t>
+      </w:r>
+      <w:r>
+        <w:rPr>
+          <w:rFonts w:ascii="Garamond" w:hAnsi="Garamond"/>
+          <w:sz w:val="23"/>
+        </w:rPr>
+        <w:t>:</w:t>
+      </w:r>
+      <w:r>
+        <w:rPr>
+          <w:rFonts w:ascii="Garamond" w:hAnsi="Garamond"/>
+          <w:sz w:val="23"/>
+        </w:rPr>
+        <w:t xml:space="preserve"> What is the unit of observation? Where are the data from? How were they collected?</w:t>
+      </w:r>
+    </w:p>
+    <w:p>
+      <w:pPr>
+        <w:pStyle w:val="ListParagraph"/>
+        <w:numPr>
+          <w:ilvl w:val="3"/>
+          <w:numId w:val="43"/>
+        </w:numPr>
+        <w:ind w:left="2520"/>
+        <w:jc w:val="both"/>
+        <w:rPr>
+          <w:rFonts w:ascii="Garamond" w:eastAsia="Garamond" w:hAnsi="Garamond" w:cs="Garamond"/>
+          <w:sz w:val="23"/>
+          <w:szCs w:val="23"/>
+          <w:lang w:eastAsia="zh-CN"/>
+        </w:rPr>
+      </w:pPr>
+      <w:r>
+        <w:rPr>
+          <w:rFonts w:ascii="Garamond" w:hAnsi="Garamond"/>
+          <w:sz w:val="23"/>
+        </w:rPr>
+        <w:t>Answers</w:t>
+      </w:r>
+      <w:r>
+        <w:rPr>
+          <w:rFonts w:ascii="Garamond" w:hAnsi="Garamond"/>
+          <w:sz w:val="23"/>
+        </w:rPr>
+        <w:t>:</w:t>
+      </w:r>
+      <w:r>
+        <w:rPr>
+          <w:rFonts w:ascii="Garamond" w:hAnsi="Garamond"/>
+          <w:sz w:val="23"/>
+        </w:rPr>
+        <w:t xml:space="preserve"> What does the paper find? What are the main weaknesses? How could it be improved?</w:t>
+      </w:r>
+    </w:p>
+    <w:p>
+      <w:pPr>
+        <w:pStyle w:val="ListParagraph"/>
+        <w:numPr>
+          <w:ilvl w:val="3"/>
+          <w:numId w:val="43"/>
+        </w:numPr>
+        <w:ind w:left="2520"/>
+        <w:jc w:val="both"/>
+        <w:rPr>
+          <w:rFonts w:ascii="Garamond" w:eastAsia="Garamond" w:hAnsi="Garamond" w:cs="Garamond"/>
+          <w:sz w:val="23"/>
+          <w:szCs w:val="23"/>
+          <w:lang w:eastAsia="zh-CN"/>
+        </w:rPr>
+      </w:pPr>
+      <w:r>
+        <w:rPr>
+          <w:rFonts w:ascii="Garamond" w:hAnsi="Garamond"/>
+          <w:sz w:val="23"/>
+        </w:rPr>
+        <w:t>Extensions</w:t>
+      </w:r>
+      <w:r>
+        <w:rPr>
+          <w:rFonts w:ascii="Garamond" w:hAnsi="Garamond"/>
+          <w:sz w:val="23"/>
+        </w:rPr>
+        <w:t>:</w:t>
+      </w:r>
+      <w:r>
+        <w:rPr>
+          <w:rFonts w:ascii="Garamond" w:hAnsi="Garamond"/>
+          <w:sz w:val="23"/>
+        </w:rPr>
+        <w:t xml:space="preserve"> After the current paper, what could be done next in this general area?</w:t>
+      </w:r>
+    </w:p>
+    <w:p>
+      <w:pPr>
+        <w:pStyle w:val="ListParagraph"/>
+        <w:numPr>
+          <w:ilvl w:val="2"/>
+          <w:numId w:val="2"/>
+        </w:numPr>
+        <w:jc w:val="both"/>
+        <w:rPr>
+          <w:rFonts w:ascii="Garamond" w:eastAsia="Garamond" w:hAnsi="Garamond" w:cs="Garamond"/>
+          <w:sz w:val="23"/>
+          <w:szCs w:val="23"/>
+          <w:lang w:eastAsia="zh-CN"/>
+        </w:rPr>
+      </w:pPr>
+      <w:r>
+        <w:rPr>
+          <w:rFonts w:ascii="Garamond" w:hAnsi="Garamond"/>
+          <w:sz w:val="23"/>
+        </w:rPr>
+        <w:t>You may also discuss: one-sentence conclusion, institutional background, conceptual framework, or relevant literature. Submit as PDF via Teams.</w:t>
+      </w:r>
+    </w:p>
+    <w:p>
+      <w:pPr>
+        <w:pStyle w:val="ListParagraph"/>
+        <w:numPr>
+          <w:ilvl w:val="1"/>
+          <w:numId w:val="2"/>
+        </w:numPr>
+        <w:jc w:val="both"/>
+        <w:rPr>
+          <w:rFonts w:ascii="Garamond" w:eastAsia="Garamond" w:hAnsi="Garamond" w:cs="Garamond"/>
+          <w:sz w:val="23"/>
+          <w:szCs w:val="23"/>
+          <w:lang w:eastAsia="zh-CN"/>
+        </w:rPr>
+      </w:pPr>
+      <w:r>
+        <w:rPr>
           <w:rFonts w:ascii="Garamond" w:eastAsia="Garamond" w:hAnsi="Garamond" w:cs="Garamond"/>
           <w:b/>
           <w:bCs/>
@@ -4880,48 +5378,6 @@
     </w:p>
     <w:p>
       <w:pPr>
-        <w:jc w:val="both"/>
-        <w:rPr>
-          <w:rFonts w:ascii="Garamond" w:eastAsia="Garamond" w:hAnsi="Garamond" w:cs="Garamond"/>
-          <w:sz w:val="23"/>
-          <w:szCs w:val="23"/>
-        </w:rPr>
-      </w:pPr>
-    </w:p>
-    <w:p>
-      <w:pPr>
-        <w:pStyle w:val="ListParagraph"/>
-        <w:jc w:val="both"/>
-        <w:rPr>
-          <w:rFonts w:ascii="Garamond" w:eastAsia="Garamond" w:hAnsi="Garamond" w:cs="Garamond"/>
-          <w:sz w:val="23"/>
-          <w:szCs w:val="23"/>
-        </w:rPr>
-      </w:pPr>
-      <w:r>
-        <w:rPr>
-          <w:rFonts w:ascii="Garamond" w:eastAsia="Garamond" w:hAnsi="Garamond" w:cs="Garamond"/>
-          <w:sz w:val="23"/>
-          <w:szCs w:val="23"/>
-          <w:lang w:eastAsia="zh-CN"/>
-        </w:rPr>
-        <w:t>Here is a brief timetable for the projects:</w:t>
-      </w:r>
-    </w:p>
-    <w:p>
-      <w:pPr>
-        <w:pStyle w:val="ListParagraph"/>
-        <w:jc w:val="both"/>
-        <w:rPr>
-          <w:rFonts w:ascii="Garamond" w:eastAsia="Garamond" w:hAnsi="Garamond" w:cs="Garamond"/>
-          <w:sz w:val="23"/>
-          <w:szCs w:val="23"/>
-          <w:lang w:eastAsia="zh-CN"/>
-        </w:rPr>
-      </w:pPr>
-    </w:p>
-    <w:p>
-      <w:pPr>
         <w:pStyle w:val="ListParagraph"/>
         <w:numPr>
           <w:ilvl w:val="1"/>
@@ -4930,42 +5386,62 @@
         <w:jc w:val="both"/>
         <w:rPr>
           <w:rFonts w:ascii="Garamond" w:eastAsia="Garamond" w:hAnsi="Garamond" w:cs="Garamond"/>
-          <w:sz w:val="23"/>
-          <w:szCs w:val="23"/>
-          <w:lang w:eastAsia="zh-CN"/>
-        </w:rPr>
-      </w:pPr>
-      <w:r>
-        <w:rPr>
-          <w:rFonts w:ascii="Garamond" w:eastAsia="Garamond" w:hAnsi="Garamond" w:cs="Garamond"/>
           <w:b/>
           <w:bCs/>
           <w:sz w:val="23"/>
           <w:szCs w:val="23"/>
           <w:lang w:eastAsia="zh-CN"/>
         </w:rPr>
-        <w:t>By Week 2</w:t>
-      </w:r>
-      <w:r>
-        <w:rPr>
-          <w:rFonts w:ascii="Garamond" w:eastAsia="Garamond" w:hAnsi="Garamond" w:cs="Garamond"/>
-          <w:b/>
-          <w:bCs/>
+      </w:pPr>
+      <w:r>
+        <w:rPr>
+          <w:rFonts w:ascii="Garamond" w:hAnsi="Garamond"/>
+          <w:sz w:val="23"/>
+        </w:rPr>
+        <w:t>Structured Peer Feedback: Final presentations are accompanied by structured peer feedback. After each presentation, every student completes a feedback form covering four areas: Research Question, Identification Strategy, Threats &amp; Limitations, and a Constructive Suggestion. Feedback forms are shared with presenters to support their final revisions. The quality and thoughtfulness of your feedback contributes to your Participation grade.</w:t>
+      </w:r>
+    </w:p>
+    <w:p>
+      <w:pPr>
+        <w:jc w:val="both"/>
+        <w:rPr>
+          <w:rFonts w:ascii="Garamond" w:eastAsia="Garamond" w:hAnsi="Garamond" w:cs="Garamond"/>
+          <w:sz w:val="23"/>
+          <w:szCs w:val="23"/>
+        </w:rPr>
+      </w:pPr>
+    </w:p>
+    <w:p>
+      <w:pPr>
+        <w:pStyle w:val="ListParagraph"/>
+        <w:jc w:val="both"/>
+        <w:rPr>
+          <w:rFonts w:ascii="Garamond" w:eastAsia="Garamond" w:hAnsi="Garamond" w:cs="Garamond"/>
+          <w:sz w:val="23"/>
+          <w:szCs w:val="23"/>
+        </w:rPr>
+      </w:pPr>
+      <w:r>
+        <w:rPr>
+          <w:rFonts w:ascii="Garamond" w:eastAsia="Garamond" w:hAnsi="Garamond" w:cs="Garamond"/>
           <w:sz w:val="23"/>
           <w:szCs w:val="23"/>
           <w:lang w:eastAsia="zh-CN"/>
         </w:rPr>
-        <w:t>:</w:t>
-      </w:r>
-      <w:r>
+        <w:t>Here is a brief timetable for the projects:</w:t>
+      </w:r>
+    </w:p>
+    <w:p>
+      <w:pPr>
+        <w:pStyle w:val="ListParagraph"/>
+        <w:jc w:val="both"/>
         <w:rPr>
           <w:rFonts w:ascii="Garamond" w:eastAsia="Garamond" w:hAnsi="Garamond" w:cs="Garamond"/>
           <w:sz w:val="23"/>
           <w:szCs w:val="23"/>
           <w:lang w:eastAsia="zh-CN"/>
         </w:rPr>
-        <w:t xml:space="preserve"> Find a collaborator or obtain permission from the instructor to work on an individual project.</w:t>
-      </w:r>
+      </w:pPr>
     </w:p>
     <w:p>
       <w:pPr>
@@ -4991,7 +5467,7 @@
           <w:szCs w:val="23"/>
           <w:lang w:eastAsia="zh-CN"/>
         </w:rPr>
-        <w:t>By Week 5</w:t>
+        <w:t>By Week 2</w:t>
       </w:r>
       <w:r>
         <w:rPr>
@@ -5011,7 +5487,7 @@
           <w:szCs w:val="23"/>
           <w:lang w:eastAsia="zh-CN"/>
         </w:rPr>
-        <w:t xml:space="preserve"> Submit a short (half-page) description of your proposed project and a feasible plan for carrying out the research.</w:t>
+        <w:t xml:space="preserve"> Find a collaborator or obtain permission from the instructor to work on an individual project.</w:t>
       </w:r>
     </w:p>
     <w:p>
@@ -5038,7 +5514,7 @@
           <w:szCs w:val="23"/>
           <w:lang w:eastAsia="zh-CN"/>
         </w:rPr>
-        <w:t>By Week 10</w:t>
+        <w:t>By Week 5</w:t>
       </w:r>
       <w:r>
         <w:rPr>
@@ -5058,27 +5534,7 @@
           <w:szCs w:val="23"/>
           <w:lang w:eastAsia="zh-CN"/>
         </w:rPr>
-        <w:t xml:space="preserve"> Submit a brief (no longer than 5 page) page memo of your main results, including tables, figures, and brief analysis. For methodological projects, this should include a description of the method and any analytical/simulation results. You will be </w:t>
-      </w:r>
-      <w:r>
-        <w:rPr>
-          <w:rFonts w:ascii="Garamond" w:eastAsia="Garamond" w:hAnsi="Garamond" w:cs="Garamond"/>
-          <w:sz w:val="23"/>
-          <w:szCs w:val="23"/>
-          <w:u w:val="single"/>
-          <w:lang w:eastAsia="zh-CN"/>
-        </w:rPr>
-        <w:lastRenderedPageBreak/>
-        <w:t>required to give feedback on another group’s project</w:t>
-      </w:r>
-      <w:r>
-        <w:rPr>
-          <w:rFonts w:ascii="Garamond" w:eastAsia="Garamond" w:hAnsi="Garamond" w:cs="Garamond"/>
-          <w:sz w:val="23"/>
-          <w:szCs w:val="23"/>
-          <w:lang w:eastAsia="zh-CN"/>
-        </w:rPr>
-        <w:t>, which will be counted toward the overall grade based on attentiveness and usefulness of the feedback provided.</w:t>
+        <w:t xml:space="preserve"> Submit a short (half-page) description of your proposed project and a feasible plan for carrying out the research.</w:t>
       </w:r>
     </w:p>
     <w:p>
@@ -5105,7 +5561,7 @@
           <w:szCs w:val="23"/>
           <w:lang w:eastAsia="zh-CN"/>
         </w:rPr>
-        <w:t>By Week 16</w:t>
+        <w:t>By Week 10</w:t>
       </w:r>
       <w:r>
         <w:rPr>
@@ -5125,25 +5581,81 @@
           <w:szCs w:val="23"/>
           <w:lang w:eastAsia="zh-CN"/>
         </w:rPr>
-        <w:t xml:space="preserve"> Submit your final version of the project.</w:t>
+        <w:t xml:space="preserve"> Submit a brief (no longer than 5 page) page memo of your main results, including tables, figures, and brief analysis. For methodological projects, this should include a description of the method and any analytical/simulation results. You will be </w:t>
+      </w:r>
+      <w:r>
+        <w:rPr>
+          <w:rFonts w:ascii="Garamond" w:eastAsia="Garamond" w:hAnsi="Garamond" w:cs="Garamond"/>
+          <w:sz w:val="23"/>
+          <w:szCs w:val="23"/>
+          <w:u w:val="single"/>
+          <w:lang w:eastAsia="zh-CN"/>
+        </w:rPr>
+        <w:t>required to give feedback on another group’s project</w:t>
+      </w:r>
+      <w:r>
+        <w:rPr>
+          <w:rFonts w:ascii="Garamond" w:eastAsia="Garamond" w:hAnsi="Garamond" w:cs="Garamond"/>
+          <w:sz w:val="23"/>
+          <w:szCs w:val="23"/>
+          <w:lang w:eastAsia="zh-CN"/>
+        </w:rPr>
+        <w:t>, which will be counted toward the overall grade based on attentiveness and usefulness of the feedback provided.</w:t>
       </w:r>
     </w:p>
     <w:p>
       <w:pPr>
+        <w:pStyle w:val="ListParagraph"/>
+        <w:numPr>
+          <w:ilvl w:val="1"/>
+          <w:numId w:val="2"/>
+        </w:numPr>
         <w:jc w:val="both"/>
         <w:rPr>
           <w:rFonts w:ascii="Garamond" w:eastAsia="Garamond" w:hAnsi="Garamond" w:cs="Garamond"/>
+          <w:sz w:val="23"/>
+          <w:szCs w:val="23"/>
+          <w:lang w:eastAsia="zh-CN"/>
+        </w:rPr>
+      </w:pPr>
+      <w:r>
+        <w:rPr>
+          <w:rFonts w:ascii="Garamond" w:eastAsia="Garamond" w:hAnsi="Garamond" w:cs="Garamond"/>
+          <w:b/>
           <w:bCs/>
           <w:sz w:val="23"/>
           <w:szCs w:val="23"/>
-        </w:rPr>
-      </w:pPr>
+          <w:lang w:eastAsia="zh-CN"/>
+        </w:rPr>
+        <w:t>By Week 15</w:t>
+      </w:r>
+      <w:r>
+        <w:rPr>
+          <w:rFonts w:ascii="Garamond" w:eastAsia="Garamond" w:hAnsi="Garamond" w:cs="Garamond"/>
+          <w:b/>
+          <w:bCs/>
+          <w:sz w:val="23"/>
+          <w:szCs w:val="23"/>
+          <w:lang w:eastAsia="zh-CN"/>
+        </w:rPr>
+        <w:t>:</w:t>
+      </w:r>
+      <w:r>
+        <w:rPr>
+          <w:rFonts w:ascii="Garamond" w:eastAsia="Garamond" w:hAnsi="Garamond" w:cs="Garamond"/>
+          <w:sz w:val="23"/>
+          <w:szCs w:val="23"/>
+          <w:lang w:eastAsia="zh-CN"/>
+        </w:rPr>
+        <w:t xml:space="preserve"> Submit your final version of the project.</w:t>
+      </w:r>
     </w:p>
     <w:p>
       <w:pPr>
         <w:jc w:val="both"/>
         <w:rPr>
           <w:rFonts w:ascii="Garamond" w:eastAsia="Garamond" w:hAnsi="Garamond" w:cs="Garamond"/>
+          <w:bCs/>
           <w:sz w:val="23"/>
           <w:szCs w:val="23"/>
         </w:rPr>
@@ -5151,6 +5663,16 @@
     </w:p>
     <w:p>
       <w:pPr>
+        <w:jc w:val="both"/>
+        <w:rPr>
+          <w:rFonts w:ascii="Garamond" w:eastAsia="Garamond" w:hAnsi="Garamond" w:cs="Garamond"/>
+          <w:sz w:val="23"/>
+          <w:szCs w:val="23"/>
+        </w:rPr>
+      </w:pPr>
+    </w:p>
+    <w:p>
+      <w:pPr>
         <w:rPr>
           <w:rFonts w:ascii="Garamond" w:eastAsia="Garamond" w:hAnsi="Garamond" w:cs="Garamond"/>
           <w:b/>
@@ -5165,6 +5687,26 @@
           <w:sz w:val="23"/>
           <w:szCs w:val="23"/>
         </w:rPr>
+        <w:br w:type="page"/>
+      </w:r>
+    </w:p>
+    <w:p>
+      <w:pPr>
+        <w:rPr>
+          <w:rFonts w:ascii="Garamond" w:eastAsia="Garamond" w:hAnsi="Garamond" w:cs="Garamond"/>
+          <w:b/>
+          <w:sz w:val="23"/>
+          <w:szCs w:val="23"/>
+        </w:rPr>
+      </w:pPr>
+      <w:r>
+        <w:rPr>
+          <w:rFonts w:ascii="Garamond" w:eastAsia="Garamond" w:hAnsi="Garamond" w:cs="Garamond"/>
+          <w:b/>
+          <w:sz w:val="23"/>
+          <w:szCs w:val="23"/>
+        </w:rPr>
+        <w:lastRenderedPageBreak/>
         <w:t>COURSE SCHEDULE:</w:t>
       </w:r>
     </w:p>
@@ -5689,7 +6231,6 @@
                 <w:szCs w:val="22"/>
               </w:rPr>
             </w:pPr>
-            <w:proofErr w:type="spellStart"/>
             <w:r>
               <w:rPr>
                 <w:rFonts w:ascii="Garamond" w:eastAsia="Garamond" w:hAnsi="Garamond" w:cs="Garamond"/>
@@ -5698,18 +6239,7 @@
                 <w:sz w:val="22"/>
                 <w:szCs w:val="22"/>
               </w:rPr>
-              <w:t>Imbens</w:t>
-            </w:r>
-            <w:proofErr w:type="spellEnd"/>
-            <w:r>
-              <w:rPr>
-                <w:rFonts w:ascii="Garamond" w:eastAsia="Garamond" w:hAnsi="Garamond" w:cs="Garamond"/>
-                <w:bCs/>
-                <w:color w:val="000000" w:themeColor="text1"/>
-                <w:sz w:val="22"/>
-                <w:szCs w:val="22"/>
-              </w:rPr>
-              <w:t xml:space="preserve"> &amp; Rubin, Ch. 1</w:t>
+              <w:t>Imbens &amp; Rubin, Ch. 1</w:t>
             </w:r>
           </w:p>
           <w:p>
@@ -6047,6 +6577,7 @@
               <w:t xml:space="preserve"> null, randomization distribution</w:t>
             </w:r>
           </w:p>
+          <w:p/>
           <w:p>
             <w:pPr>
               <w:widowControl w:val="0"/>
@@ -6064,6 +6595,13 @@
                 <w:szCs w:val="22"/>
               </w:rPr>
             </w:pPr>
+            <w:r>
+              <w:rPr>
+                <w:i/>
+                <w:sz w:val="20"/>
+              </w:rPr>
+              <w:t>Due: The Effect CH. 2 Research Questions</w:t>
+            </w:r>
           </w:p>
           <w:p>
             <w:pPr>
@@ -6135,7 +6673,6 @@
                 <w:szCs w:val="22"/>
               </w:rPr>
             </w:pPr>
-            <w:proofErr w:type="spellStart"/>
             <w:r>
               <w:rPr>
                 <w:rFonts w:ascii="Garamond" w:eastAsia="Garamond" w:hAnsi="Garamond" w:cs="Garamond"/>
@@ -6144,18 +6681,7 @@
                 <w:sz w:val="22"/>
                 <w:szCs w:val="22"/>
               </w:rPr>
-              <w:t>Imbens</w:t>
-            </w:r>
-            <w:proofErr w:type="spellEnd"/>
-            <w:r>
-              <w:rPr>
-                <w:rFonts w:ascii="Garamond" w:eastAsia="Garamond" w:hAnsi="Garamond" w:cs="Garamond"/>
-                <w:bCs/>
-                <w:color w:val="000000" w:themeColor="text1"/>
-                <w:sz w:val="22"/>
-                <w:szCs w:val="22"/>
-              </w:rPr>
-              <w:t xml:space="preserve"> </w:t>
+              <w:t xml:space="preserve">Imbens </w:t>
             </w:r>
             <w:r>
               <w:rPr>
@@ -6465,6 +6991,35 @@
               <w:t>Finite-sample vs superpopulation inference</w:t>
             </w:r>
           </w:p>
+          <w:p/>
+          <w:p>
+            <w:pPr>
+              <w:widowControl w:val="0"/>
+              <w:ind w:left="75"/>
+              <w:rPr>
+                <w:rFonts w:ascii="Garamond" w:eastAsia="Garamond" w:hAnsi="Garamond" w:cs="Garamond"/>
+                <w:bCs/>
+                <w:color w:val="000000" w:themeColor="text1"/>
+                <w:sz w:val="20"/>
+                <w:szCs w:val="20"/>
+              </w:rPr>
+            </w:pPr>
+            <w:r>
+              <w:rPr>
+                <w:i/>
+                <w:sz w:val="20"/>
+                <w:szCs w:val="20"/>
+              </w:rPr>
+              <w:t>Due: Problem Set 1 (Potential Outcomes); The Effect CH. 3 Describing Variables</w:t>
+            </w:r>
+            <w:r>
+              <w:rPr>
+                <w:i/>
+                <w:sz w:val="20"/>
+                <w:szCs w:val="20"/>
+              </w:rPr>
+            </w:r>
+          </w:p>
         </w:tc>
         <w:tc>
           <w:tcPr>
@@ -6499,7 +7054,6 @@
                 <w:szCs w:val="22"/>
               </w:rPr>
             </w:pPr>
-            <w:proofErr w:type="spellStart"/>
             <w:r>
               <w:rPr>
                 <w:rFonts w:ascii="Garamond" w:eastAsia="Garamond" w:hAnsi="Garamond" w:cs="Garamond"/>
@@ -6508,18 +7062,7 @@
                 <w:sz w:val="22"/>
                 <w:szCs w:val="22"/>
               </w:rPr>
-              <w:t>Imbens</w:t>
-            </w:r>
-            <w:proofErr w:type="spellEnd"/>
-            <w:r>
-              <w:rPr>
-                <w:rFonts w:ascii="Garamond" w:eastAsia="Garamond" w:hAnsi="Garamond" w:cs="Garamond"/>
-                <w:bCs/>
-                <w:color w:val="000000" w:themeColor="text1"/>
-                <w:sz w:val="22"/>
-                <w:szCs w:val="22"/>
-              </w:rPr>
-              <w:t xml:space="preserve"> &amp; Rubin, Ch</w:t>
+              <w:t>Imbens &amp; Rubin, Ch</w:t>
             </w:r>
             <w:r>
               <w:rPr>
@@ -6812,6 +7355,35 @@
               <w:t>Students’ Paper Introduction Presentations:  1.1. and 1.2.</w:t>
             </w:r>
           </w:p>
+          <w:p>
+            <w:pPr>
+              <w:widowControl w:val="0"/>
+              <w:rPr>
+                <w:i/>
+                <w:sz w:val="20"/>
+                <w:szCs w:val="20"/>
+              </w:rPr>
+            </w:pPr>
+          </w:p>
+          <w:p>
+            <w:pPr>
+              <w:widowControl w:val="0"/>
+              <w:rPr>
+                <w:rFonts w:ascii="Garamond" w:eastAsia="Garamond" w:hAnsi="Garamond" w:cs="Garamond"/>
+                <w:color w:val="000000" w:themeColor="text1"/>
+                <w:sz w:val="20"/>
+                <w:szCs w:val="20"/>
+              </w:rPr>
+            </w:pPr>
+            <w:r>
+              <w:rPr>
+                <w:i/>
+                <w:sz w:val="20"/>
+                <w:szCs w:val="20"/>
+              </w:rPr>
+              <w:t>Due: Problem Set 2 (Randomization Inference); The Effect CH. 4 Describing Relationships</w:t>
+            </w:r>
+          </w:p>
         </w:tc>
         <w:tc>
           <w:tcPr>
@@ -6846,7 +7418,6 @@
                 <w:szCs w:val="22"/>
               </w:rPr>
             </w:pPr>
-            <w:proofErr w:type="spellStart"/>
             <w:r>
               <w:rPr>
                 <w:rFonts w:ascii="Garamond" w:eastAsia="Garamond" w:hAnsi="Garamond" w:cs="Garamond"/>
@@ -6855,18 +7426,7 @@
                 <w:sz w:val="22"/>
                 <w:szCs w:val="22"/>
               </w:rPr>
-              <w:t>Imbens</w:t>
-            </w:r>
-            <w:proofErr w:type="spellEnd"/>
-            <w:r>
-              <w:rPr>
-                <w:rFonts w:ascii="Garamond" w:eastAsia="Garamond" w:hAnsi="Garamond" w:cs="Garamond"/>
-                <w:bCs/>
-                <w:color w:val="000000" w:themeColor="text1"/>
-                <w:sz w:val="22"/>
-                <w:szCs w:val="22"/>
-              </w:rPr>
-              <w:t xml:space="preserve"> &amp; Rubin, Ch</w:t>
+              <w:t>Imbens &amp; Rubin, Ch</w:t>
             </w:r>
             <w:r>
               <w:rPr>
@@ -7189,15 +7749,41 @@
                 <w:szCs w:val="22"/>
               </w:rPr>
             </w:pPr>
-            <w:r>
-              <w:rPr>
-                <w:rFonts w:ascii="Garamond" w:eastAsia="Garamond" w:hAnsi="Garamond" w:cs="Garamond"/>
-                <w:color w:val="000000" w:themeColor="text1"/>
-                <w:sz w:val="22"/>
-                <w:szCs w:val="22"/>
-                <w:u w:val="single"/>
-              </w:rPr>
-              <w:t>Submit a half-page description of your proposed project &amp; plan.</w:t>
+          </w:p>
+          <w:p>
+            <w:pPr>
+              <w:widowControl w:val="0"/>
+              <w:rPr>
+                <w:rFonts w:ascii="Garamond" w:eastAsia="Garamond" w:hAnsi="Garamond" w:cs="Garamond"/>
+                <w:color w:val="000000" w:themeColor="text1"/>
+                <w:sz w:val="20"/>
+                <w:szCs w:val="20"/>
+              </w:rPr>
+            </w:pPr>
+            <w:r>
+              <w:rPr>
+                <w:i/>
+                <w:sz w:val="20"/>
+                <w:szCs w:val="20"/>
+              </w:rPr>
+              <w:t>Due: Problem Set 3 (Inference for the ATE); The Effect CH. 13 Regression; Project Proposal</w:t>
+            </w:r>
+            <w:r>
+              <w:rPr>
+                <w:i/>
+                <w:sz w:val="20"/>
+                <w:szCs w:val="20"/>
+              </w:rPr>
+            </w:r>
+            <w:r>
+              <w:rPr>
+                <w:b/>
+                <w:bCs/>
+                <w:i/>
+                <w:color w:val="7030A0"/>
+                <w:sz w:val="20"/>
+                <w:szCs w:val="20"/>
+              </w:rPr>
             </w:r>
           </w:p>
         </w:tc>
@@ -7508,7 +8094,6 @@
                 <w:szCs w:val="22"/>
               </w:rPr>
             </w:pPr>
-            <w:proofErr w:type="spellStart"/>
             <w:r>
               <w:rPr>
                 <w:rFonts w:ascii="Garamond" w:eastAsia="Garamond" w:hAnsi="Garamond" w:cs="Garamond"/>
@@ -7517,18 +8102,7 @@
                 <w:sz w:val="22"/>
                 <w:szCs w:val="22"/>
               </w:rPr>
-              <w:t>Imbens</w:t>
-            </w:r>
-            <w:proofErr w:type="spellEnd"/>
-            <w:r>
-              <w:rPr>
-                <w:rFonts w:ascii="Garamond" w:eastAsia="Garamond" w:hAnsi="Garamond" w:cs="Garamond"/>
-                <w:bCs/>
-                <w:color w:val="000000" w:themeColor="text1"/>
-                <w:sz w:val="22"/>
-                <w:szCs w:val="22"/>
-              </w:rPr>
-              <w:t xml:space="preserve"> &amp; Rubin, Ch</w:t>
+              <w:t>Imbens &amp; Rubin, Ch</w:t>
             </w:r>
             <w:r>
               <w:rPr>
@@ -7716,17 +8290,47 @@
                 <w:color w:val="000000" w:themeColor="text1"/>
                 <w:sz w:val="22"/>
                 <w:szCs w:val="22"/>
+              </w:rPr>
+            </w:pPr>
+            <w:r>
+              <w:rPr>
+                <w:rFonts w:ascii="Garamond" w:eastAsia="Garamond" w:hAnsi="Garamond" w:cs="Garamond"/>
+                <w:color w:val="000000" w:themeColor="text1"/>
+                <w:sz w:val="22"/>
+                <w:szCs w:val="22"/>
+              </w:rPr>
+              <w:t>The purpose of the meetings is to help each group materialize their ideas/topics for the group project.</w:t>
+            </w:r>
+          </w:p>
+          <w:p>
+            <w:pPr>
+              <w:widowControl w:val="0"/>
+              <w:rPr>
+                <w:rFonts w:ascii="Garamond" w:eastAsia="Garamond" w:hAnsi="Garamond" w:cs="Garamond"/>
+                <w:color w:val="000000" w:themeColor="text1"/>
+                <w:sz w:val="22"/>
+                <w:szCs w:val="22"/>
+              </w:rPr>
+            </w:pPr>
+          </w:p>
+          <w:p>
+            <w:pPr>
+              <w:widowControl w:val="0"/>
+              <w:rPr>
+                <w:rFonts w:ascii="Garamond" w:eastAsia="Garamond" w:hAnsi="Garamond" w:cs="Garamond"/>
+                <w:color w:val="000000" w:themeColor="text1"/>
+                <w:sz w:val="22"/>
+                <w:szCs w:val="22"/>
                 <w:u w:val="single"/>
               </w:rPr>
             </w:pPr>
             <w:r>
               <w:rPr>
-                <w:rFonts w:ascii="Garamond" w:eastAsia="Garamond" w:hAnsi="Garamond" w:cs="Garamond"/>
-                <w:color w:val="000000" w:themeColor="text1"/>
-                <w:sz w:val="22"/>
-                <w:szCs w:val="22"/>
-              </w:rPr>
-              <w:t>The purpose of the meetings is to help each group materialize their ideas/topics for the group project.</w:t>
+                <w:i/>
+                <w:sz w:val="20"/>
+                <w:szCs w:val="20"/>
+              </w:rPr>
+              <w:t>Due: The Effect CH. 6 Causal Diagrams, CH. 7 Drawing Causal Diagrams</w:t>
             </w:r>
           </w:p>
         </w:tc>
@@ -7973,6 +8577,35 @@
               <w:t>Students’ Paper Introduction Presentations:  2.1. and 2.2.</w:t>
             </w:r>
           </w:p>
+          <w:p>
+            <w:pPr>
+              <w:widowControl w:val="0"/>
+              <w:rPr>
+                <w:i/>
+              </w:rPr>
+            </w:pPr>
+          </w:p>
+          <w:p>
+            <w:pPr>
+              <w:widowControl w:val="0"/>
+              <w:rPr>
+                <w:rFonts w:ascii="Garamond" w:eastAsia="Garamond" w:hAnsi="Garamond" w:cs="Garamond"/>
+                <w:b/>
+                <w:bCs/>
+                <w:color w:val="000000" w:themeColor="text1"/>
+                <w:sz w:val="20"/>
+                <w:szCs w:val="20"/>
+              </w:rPr>
+            </w:pPr>
+            <w:r>
+              <w:rPr>
+                <w:i/>
+                <w:sz w:val="20"/>
+                <w:szCs w:val="20"/>
+              </w:rPr>
+              <w:t>Due: Problem Set 4 (Observational Studies); The Effect CH. 8 Causal Paths and Closing Back Doors</w:t>
+            </w:r>
+          </w:p>
         </w:tc>
         <w:tc>
           <w:tcPr>
@@ -8014,7 +8647,6 @@
                 <w:szCs w:val="22"/>
               </w:rPr>
             </w:pPr>
-            <w:proofErr w:type="spellStart"/>
             <w:r>
               <w:rPr>
                 <w:rFonts w:ascii="Garamond" w:eastAsia="Garamond" w:hAnsi="Garamond" w:cs="Garamond"/>
@@ -8023,18 +8655,7 @@
                 <w:sz w:val="22"/>
                 <w:szCs w:val="22"/>
               </w:rPr>
-              <w:t>Imbens</w:t>
-            </w:r>
-            <w:proofErr w:type="spellEnd"/>
-            <w:r>
-              <w:rPr>
-                <w:rFonts w:ascii="Garamond" w:eastAsia="Garamond" w:hAnsi="Garamond" w:cs="Garamond"/>
-                <w:bCs/>
-                <w:color w:val="000000" w:themeColor="text1"/>
-                <w:sz w:val="22"/>
-                <w:szCs w:val="22"/>
-              </w:rPr>
-              <w:t xml:space="preserve"> &amp; Rubin, Ch</w:t>
+              <w:t>Imbens &amp; Rubin, Ch</w:t>
             </w:r>
             <w:r>
               <w:rPr>
@@ -8286,6 +8907,14 @@
               </w:rPr>
               <w:t>Students’ Paper Introduction Presentations:  2.3. and 2.4.</w:t>
             </w:r>
+          </w:p>
+          <w:p>
+            <w:pPr>
+              <w:widowControl w:val="0"/>
+              <w:rPr>
+                <w:i/>
+              </w:rPr>
+            </w:pPr>
           </w:p>
         </w:tc>
         <w:tc>
@@ -8508,52 +9137,65 @@
               <w:widowControl w:val="0"/>
               <w:rPr>
                 <w:rFonts w:ascii="Garamond" w:eastAsia="Garamond" w:hAnsi="Garamond" w:cs="Garamond"/>
-                <w:color w:val="7030A0"/>
+                <w:color w:val="000000" w:themeColor="text1"/>
+                <w:sz w:val="22"/>
+                <w:szCs w:val="22"/>
+                <w:lang w:eastAsia="ko-KR"/>
+              </w:rPr>
+            </w:pPr>
+            <w:r>
+              <w:rPr>
+                <w:rFonts w:ascii="Garamond" w:eastAsia="Garamond" w:hAnsi="Garamond" w:cs="Garamond"/>
+                <w:color w:val="000000" w:themeColor="text1"/>
                 <w:sz w:val="22"/>
                 <w:szCs w:val="22"/>
                 <w:u w:val="single"/>
               </w:rPr>
-            </w:pPr>
-            <w:r>
-              <w:rPr>
-                <w:rFonts w:ascii="Garamond" w:eastAsia="Garamond" w:hAnsi="Garamond" w:cs="Garamond"/>
-                <w:color w:val="7030A0"/>
-                <w:sz w:val="22"/>
-                <w:szCs w:val="22"/>
-              </w:rPr>
-              <w:t xml:space="preserve">* </w:t>
-            </w:r>
-            <w:r>
-              <w:rPr>
-                <w:rFonts w:ascii="Garamond" w:eastAsia="Garamond" w:hAnsi="Garamond" w:cs="Garamond"/>
-                <w:color w:val="7030A0"/>
-                <w:sz w:val="22"/>
-                <w:szCs w:val="22"/>
-                <w:u w:val="single"/>
-              </w:rPr>
-              <w:t>Submit a progress report.</w:t>
+              <w:t>Students’ Paper Introduction Presentations:  3.1. and 3.2.</w:t>
             </w:r>
           </w:p>
+          <w:p/>
           <w:p>
             <w:pPr>
               <w:widowControl w:val="0"/>
               <w:rPr>
                 <w:rFonts w:ascii="Garamond" w:eastAsia="Garamond" w:hAnsi="Garamond" w:cs="Garamond"/>
                 <w:color w:val="000000" w:themeColor="text1"/>
-                <w:sz w:val="22"/>
-                <w:szCs w:val="22"/>
+                <w:sz w:val="20"/>
+                <w:szCs w:val="20"/>
                 <w:lang w:eastAsia="ko-KR"/>
               </w:rPr>
             </w:pPr>
             <w:r>
               <w:rPr>
-                <w:rFonts w:ascii="Garamond" w:eastAsia="Garamond" w:hAnsi="Garamond" w:cs="Garamond"/>
-                <w:color w:val="000000" w:themeColor="text1"/>
-                <w:sz w:val="22"/>
-                <w:szCs w:val="22"/>
-                <w:u w:val="single"/>
-              </w:rPr>
-              <w:t>Students’ Paper Introduction Presentations:  3.1. and 3.2.</w:t>
+                <w:i/>
+                <w:sz w:val="20"/>
+              </w:rPr>
+              <w:t>Due: Problem Set 5 (Instrumental Variables); The Effect CH. 19 Instrumental Variables; Progress Report</w:t>
+            </w:r>
+            <w:r>
+              <w:rPr>
+                <w:i/>
+                <w:sz w:val="20"/>
+                <w:szCs w:val="20"/>
+              </w:rPr>
+            </w:r>
+            <w:r>
+              <w:rPr>
+                <w:i/>
+                <w:sz w:val="20"/>
+                <w:szCs w:val="20"/>
+              </w:rPr>
+            </w:r>
+            <w:r>
+              <w:rPr>
+                <w:b/>
+                <w:bCs/>
+                <w:i/>
+                <w:color w:val="7030A0"/>
+                <w:sz w:val="20"/>
+                <w:szCs w:val="20"/>
+              </w:rPr>
             </w:r>
           </w:p>
         </w:tc>
@@ -8882,6 +9524,37 @@
                 <w:u w:val="single"/>
               </w:rPr>
               <w:t>Students’ Paper Introduction Presentations:  3.3. and 3.4.</w:t>
+            </w:r>
+          </w:p>
+          <w:p>
+            <w:pPr>
+              <w:widowControl w:val="0"/>
+              <w:rPr>
+                <w:i/>
+                <w:sz w:val="20"/>
+                <w:szCs w:val="20"/>
+              </w:rPr>
+            </w:pPr>
+          </w:p>
+          <w:p>
+            <w:pPr>
+              <w:widowControl w:val="0"/>
+              <w:rPr>
+                <w:rFonts w:ascii="Garamond" w:eastAsia="Garamond" w:hAnsi="Garamond" w:cs="Garamond"/>
+                <w:color w:val="000000" w:themeColor="text1"/>
+                <w:sz w:val="20"/>
+                <w:szCs w:val="20"/>
+                <w:u w:val="single"/>
+                <w:lang w:eastAsia="ko-KR"/>
+              </w:rPr>
+            </w:pPr>
+            <w:r>
+              <w:rPr>
+                <w:i/>
+                <w:sz w:val="20"/>
+                <w:szCs w:val="20"/>
+              </w:rPr>
+              <w:t>Due: The Effect CH. 18 Difference-in-Differences</w:t>
             </w:r>
           </w:p>
         </w:tc>
@@ -8963,6 +9636,7 @@
                 <w:sz w:val="22"/>
                 <w:szCs w:val="22"/>
               </w:rPr>
+              <w:lastRenderedPageBreak/>
               <w:t>12</w:t>
             </w:r>
           </w:p>
@@ -9081,8 +9755,18 @@
                 <w:szCs w:val="22"/>
                 <w:u w:val="single"/>
               </w:rPr>
-              <w:t>Students’ Paper Introduction Presentations:  4.1. and 4.2.</w:t>
-            </w:r>
+              <w:t>Students’ Paper Introduction Presentations:  4.1., 4.2., 4.3., and 4.4.</w:t>
+            </w:r>
+          </w:p>
+          <w:p>
+            <w:pPr>
+              <w:widowControl w:val="0"/>
+              <w:rPr>
+                <w:i/>
+                <w:sz w:val="20"/>
+                <w:szCs w:val="20"/>
+              </w:rPr>
+            </w:pPr>
           </w:p>
         </w:tc>
         <w:tc>
@@ -9118,7 +9802,6 @@
                 <w:szCs w:val="22"/>
               </w:rPr>
             </w:pPr>
-            <w:proofErr w:type="spellStart"/>
             <w:r>
               <w:rPr>
                 <w:rFonts w:ascii="Garamond" w:eastAsia="Garamond" w:hAnsi="Garamond" w:cs="Garamond"/>
@@ -9127,18 +9810,7 @@
                 <w:sz w:val="22"/>
                 <w:szCs w:val="22"/>
               </w:rPr>
-              <w:t>Imbens</w:t>
-            </w:r>
-            <w:proofErr w:type="spellEnd"/>
-            <w:r>
-              <w:rPr>
-                <w:rFonts w:ascii="Garamond" w:eastAsia="Garamond" w:hAnsi="Garamond" w:cs="Garamond"/>
-                <w:bCs/>
-                <w:color w:val="000000" w:themeColor="text1"/>
-                <w:sz w:val="22"/>
-                <w:szCs w:val="22"/>
-              </w:rPr>
-              <w:t xml:space="preserve"> &amp; Rubin, Ch</w:t>
+              <w:t>Imbens &amp; Rubin, Ch</w:t>
             </w:r>
             <w:r>
               <w:rPr>
@@ -9405,7 +10077,34 @@
                 <w:szCs w:val="22"/>
                 <w:u w:val="single"/>
               </w:rPr>
-              <w:t>Students’ Paper Introduction Presentations:  4.3. and 4.4.</w:t>
+              <w:t>Students’ Paper Introduction Presentations:  5.1. and 5.2.</w:t>
+            </w:r>
+          </w:p>
+          <w:p>
+            <w:pPr>
+              <w:widowControl w:val="0"/>
+              <w:rPr>
+                <w:i/>
+              </w:rPr>
+            </w:pPr>
+          </w:p>
+          <w:p>
+            <w:pPr>
+              <w:widowControl w:val="0"/>
+              <w:rPr>
+                <w:rFonts w:ascii="Garamond" w:eastAsia="Garamond" w:hAnsi="Garamond" w:cs="Garamond"/>
+                <w:color w:val="000000" w:themeColor="text1"/>
+                <w:sz w:val="20"/>
+                <w:szCs w:val="20"/>
+              </w:rPr>
+            </w:pPr>
+            <w:r>
+              <w:rPr>
+                <w:i/>
+                <w:sz w:val="20"/>
+                <w:szCs w:val="20"/>
+              </w:rPr>
+              <w:t>Due: The Effect CH. 14 Matching</w:t>
             </w:r>
           </w:p>
         </w:tc>
@@ -9529,7 +10228,6 @@
                 <w:szCs w:val="22"/>
               </w:rPr>
             </w:pPr>
-            <w:proofErr w:type="spellStart"/>
             <w:r>
               <w:rPr>
                 <w:rFonts w:ascii="Garamond" w:eastAsia="Garamond" w:hAnsi="Garamond" w:cs="Garamond"/>
@@ -9538,18 +10236,7 @@
                 <w:sz w:val="22"/>
                 <w:szCs w:val="22"/>
               </w:rPr>
-              <w:t>Imbens</w:t>
-            </w:r>
-            <w:proofErr w:type="spellEnd"/>
-            <w:r>
-              <w:rPr>
-                <w:rFonts w:ascii="Garamond" w:eastAsia="Garamond" w:hAnsi="Garamond" w:cs="Garamond"/>
-                <w:bCs/>
-                <w:color w:val="000000" w:themeColor="text1"/>
-                <w:sz w:val="22"/>
-                <w:szCs w:val="22"/>
-              </w:rPr>
-              <w:t>, Guido W., and Thomas Lemieux. 2008. </w:t>
+              <w:t>Imbens, Guido W., and Thomas Lemieux. 2008. </w:t>
             </w:r>
             <w:hyperlink r:id="rId18" w:history="1">
               <w:r>
@@ -9666,7 +10353,6 @@
                 <w:sz w:val="22"/>
                 <w:szCs w:val="22"/>
               </w:rPr>
-              <w:lastRenderedPageBreak/>
               <w:t>14</w:t>
             </w:r>
           </w:p>
@@ -9812,7 +10498,37 @@
                 <w:szCs w:val="22"/>
                 <w:u w:val="single"/>
               </w:rPr>
-              <w:t>Students’ Paper Introduction Presentations:  5.1. and 5.2.</w:t>
+              <w:t>Students’ Paper Introduction Presentations:  5.3. and 5.4.</w:t>
+            </w:r>
+          </w:p>
+          <w:p>
+            <w:pPr>
+              <w:widowControl w:val="0"/>
+              <w:rPr>
+                <w:i/>
+                <w:sz w:val="20"/>
+                <w:szCs w:val="20"/>
+              </w:rPr>
+            </w:pPr>
+          </w:p>
+          <w:p>
+            <w:pPr>
+              <w:widowControl w:val="0"/>
+              <w:rPr>
+                <w:rFonts w:ascii="Garamond" w:eastAsia="Garamond" w:hAnsi="Garamond" w:cs="Garamond"/>
+                <w:color w:val="000000" w:themeColor="text1"/>
+                <w:sz w:val="20"/>
+                <w:szCs w:val="20"/>
+                <w:lang w:eastAsia="ko-KR"/>
+              </w:rPr>
+            </w:pPr>
+            <w:r>
+              <w:rPr>
+                <w:i/>
+                <w:sz w:val="20"/>
+                <w:szCs w:val="20"/>
+              </w:rPr>
+              <w:t>Due: Problem Set 6 (Matching and Weighting Estimators)</w:t>
             </w:r>
           </w:p>
         </w:tc>
@@ -10034,7 +10750,7 @@
                 <w:sz w:val="22"/>
                 <w:szCs w:val="22"/>
               </w:rPr>
-              <w:t>Causal Mechanisms and Effect Heterogeneity</w:t>
+              <w:t>Advanced Topics (TENTATIVE)</w:t>
             </w:r>
           </w:p>
           <w:p>
@@ -10060,7 +10776,7 @@
                 <w:sz w:val="22"/>
                 <w:szCs w:val="22"/>
               </w:rPr>
-              <w:t>Causal heterogeneity and effect modification.</w:t>
+              <w:t>One of the following topics will be covered (to be announced):</w:t>
             </w:r>
           </w:p>
           <w:p>
@@ -10068,10 +10784,10 @@
               <w:pStyle w:val="ListParagraph"/>
               <w:widowControl w:val="0"/>
               <w:numPr>
-                <w:ilvl w:val="1"/>
-                <w:numId w:val="7"/>
+                <w:ilvl w:val="2"/>
+                <w:numId w:val="44"/>
               </w:numPr>
-              <w:ind w:left="255" w:hanging="180"/>
+              <w:ind w:left="443" w:hanging="90"/>
               <w:rPr>
                 <w:rFonts w:ascii="Garamond" w:eastAsia="Garamond" w:hAnsi="Garamond" w:cs="Garamond"/>
                 <w:color w:val="000000" w:themeColor="text1"/>
@@ -10079,14 +10795,38 @@
                 <w:szCs w:val="22"/>
               </w:rPr>
             </w:pPr>
-            <w:r>
-              <w:rPr>
-                <w:rFonts w:ascii="Garamond" w:eastAsia="Garamond" w:hAnsi="Garamond" w:cs="Garamond"/>
-                <w:color w:val="000000" w:themeColor="text1"/>
-                <w:sz w:val="22"/>
-                <w:szCs w:val="22"/>
-              </w:rPr>
-              <w:t>Controlled direct effects, natural direct and indirect effects.</w:t>
+            <w:proofErr w:type="gramStart"/>
+            <w:r>
+              <w:rPr>
+                <w:rFonts w:ascii="Garamond" w:eastAsia="Garamond" w:hAnsi="Garamond" w:cs="Garamond"/>
+                <w:i/>
+                <w:iCs/>
+                <w:color w:val="000000" w:themeColor="text1"/>
+                <w:sz w:val="22"/>
+                <w:szCs w:val="22"/>
+              </w:rPr>
+              <w:t>Option</w:t>
+            </w:r>
+            <w:proofErr w:type="gramEnd"/>
+            <w:r>
+              <w:rPr>
+                <w:rFonts w:ascii="Garamond" w:eastAsia="Garamond" w:hAnsi="Garamond" w:cs="Garamond"/>
+                <w:i/>
+                <w:iCs/>
+                <w:color w:val="000000" w:themeColor="text1"/>
+                <w:sz w:val="22"/>
+                <w:szCs w:val="22"/>
+              </w:rPr>
+              <w:t xml:space="preserve"> A</w:t>
+            </w:r>
+            <w:r>
+              <w:rPr>
+                <w:rFonts w:ascii="Garamond" w:eastAsia="Garamond" w:hAnsi="Garamond" w:cs="Garamond"/>
+                <w:color w:val="000000" w:themeColor="text1"/>
+                <w:sz w:val="22"/>
+                <w:szCs w:val="22"/>
+              </w:rPr>
+              <w:t xml:space="preserve"> Causal Mechanisms: Mediation analysis, controlled direct effects, natural direct and indirect effects</w:t>
             </w:r>
           </w:p>
           <w:p>
@@ -10094,10 +10834,10 @@
               <w:pStyle w:val="ListParagraph"/>
               <w:widowControl w:val="0"/>
               <w:numPr>
-                <w:ilvl w:val="1"/>
-                <w:numId w:val="7"/>
+                <w:ilvl w:val="2"/>
+                <w:numId w:val="44"/>
               </w:numPr>
-              <w:ind w:left="255" w:hanging="180"/>
+              <w:ind w:left="443" w:hanging="90"/>
               <w:rPr>
                 <w:rFonts w:ascii="Garamond" w:eastAsia="Garamond" w:hAnsi="Garamond" w:cs="Garamond"/>
                 <w:color w:val="000000" w:themeColor="text1"/>
@@ -10108,37 +10848,22 @@
             <w:r>
               <w:rPr>
                 <w:rFonts w:ascii="Garamond" w:eastAsia="Garamond" w:hAnsi="Garamond" w:cs="Garamond"/>
-                <w:color w:val="000000" w:themeColor="text1"/>
-                <w:sz w:val="22"/>
-                <w:szCs w:val="22"/>
-              </w:rPr>
-              <w:t>Causal mediation analysis.</w:t>
-            </w:r>
-          </w:p>
-          <w:p>
-            <w:pPr>
-              <w:pStyle w:val="ListParagraph"/>
-              <w:widowControl w:val="0"/>
-              <w:numPr>
-                <w:ilvl w:val="1"/>
-                <w:numId w:val="7"/>
-              </w:numPr>
-              <w:ind w:left="255" w:hanging="180"/>
-              <w:rPr>
-                <w:rFonts w:ascii="Garamond" w:eastAsia="Garamond" w:hAnsi="Garamond" w:cs="Garamond"/>
-                <w:color w:val="000000" w:themeColor="text1"/>
-                <w:sz w:val="22"/>
-                <w:szCs w:val="22"/>
-              </w:rPr>
-            </w:pPr>
-            <w:r>
-              <w:rPr>
-                <w:rFonts w:ascii="Garamond" w:eastAsia="Garamond" w:hAnsi="Garamond" w:cs="Garamond"/>
-                <w:color w:val="000000" w:themeColor="text1"/>
-                <w:sz w:val="22"/>
-                <w:szCs w:val="22"/>
-              </w:rPr>
-              <w:t>Individual treatment rules.</w:t>
+                <w:i/>
+                <w:iCs/>
+                <w:color w:val="000000" w:themeColor="text1"/>
+                <w:sz w:val="22"/>
+                <w:szCs w:val="22"/>
+              </w:rPr>
+              <w:t>Option B</w:t>
+            </w:r>
+            <w:r>
+              <w:rPr>
+                <w:rFonts w:ascii="Garamond" w:eastAsia="Garamond" w:hAnsi="Garamond" w:cs="Garamond"/>
+                <w:color w:val="000000" w:themeColor="text1"/>
+                <w:sz w:val="22"/>
+                <w:szCs w:val="22"/>
+              </w:rPr>
+              <w:t xml:space="preserve"> Causal Machine Learning: Heterogeneous treatment effects, CATE estimation, causal forests, double/debiased ML</w:t>
             </w:r>
           </w:p>
           <w:p>
@@ -10158,29 +10883,28 @@
               <w:rPr>
                 <w:rFonts w:ascii="Garamond" w:eastAsia="Garamond" w:hAnsi="Garamond" w:cs="Garamond"/>
                 <w:color w:val="000000" w:themeColor="text1"/>
-                <w:sz w:val="22"/>
-                <w:szCs w:val="22"/>
+                <w:sz w:val="20"/>
+                <w:szCs w:val="20"/>
                 <w:lang w:eastAsia="ko-KR"/>
               </w:rPr>
             </w:pPr>
             <w:r>
               <w:rPr>
-                <w:rFonts w:ascii="Garamond" w:eastAsia="Garamond" w:hAnsi="Garamond" w:cs="Garamond"/>
+                <w:i/>
+                <w:sz w:val="20"/>
+                <w:szCs w:val="20"/>
+              </w:rPr>
+              <w:t>Due: The Effect CH. 20 Regression Discontinuity; Final Report</w:t>
+            </w:r>
+            <w:r>
+              <w:rPr>
+                <w:b/>
+                <w:bCs/>
+                <w:i/>
                 <w:color w:val="7030A0"/>
-                <w:sz w:val="22"/>
-                <w:szCs w:val="22"/>
-              </w:rPr>
-              <w:t xml:space="preserve">* </w:t>
-            </w:r>
-            <w:r>
-              <w:rPr>
-                <w:rFonts w:ascii="Garamond" w:eastAsia="Garamond" w:hAnsi="Garamond" w:cs="Garamond"/>
-                <w:color w:val="7030A0"/>
-                <w:sz w:val="22"/>
-                <w:szCs w:val="22"/>
-                <w:u w:val="single"/>
-              </w:rPr>
-              <w:t>Submit a final project report.</w:t>
+                <w:sz w:val="20"/>
+                <w:szCs w:val="20"/>
+              </w:rPr>
             </w:r>
           </w:p>
         </w:tc>
@@ -10476,45 +11200,95 @@
     <w:p>
       <w:pPr>
         <w:rPr>
-          <w:rFonts w:eastAsia="Garamond"/>
+          <w:rFonts w:ascii="Garamond" w:eastAsia="Garamond" w:hAnsi="Garamond" w:cs="Garamond"/>
+          <w:b/>
+          <w:sz w:val="23"/>
+          <w:szCs w:val="23"/>
         </w:rPr>
       </w:pPr>
     </w:p>
     <w:p>
       <w:pPr>
-        <w:rPr>
-          <w:rFonts w:eastAsia="Garamond"/>
-        </w:rPr>
-      </w:pPr>
+        <w:spacing w:line="360" w:lineRule="auto"/>
+        <w:rPr>
+          <w:rFonts w:ascii="Garamond" w:eastAsia="Garamond" w:hAnsi="Garamond" w:cs="Garamond"/>
+          <w:b/>
+          <w:sz w:val="23"/>
+          <w:szCs w:val="23"/>
+        </w:rPr>
+      </w:pPr>
+      <w:r>
+        <w:rPr>
+          <w:rFonts w:ascii="Garamond" w:eastAsia="Garamond" w:hAnsi="Garamond" w:cs="Garamond"/>
+          <w:b/>
+          <w:sz w:val="23"/>
+          <w:szCs w:val="23"/>
+        </w:rPr>
+        <w:lastRenderedPageBreak/>
+        <w:t>READING ASSIGNMENTS:</w:t>
+      </w:r>
     </w:p>
     <w:p>
       <w:pPr>
         <w:rPr>
-          <w:rFonts w:ascii="Garamond" w:eastAsia="Garamond" w:hAnsi="Garamond" w:cs="Garamond"/>
-          <w:b/>
-          <w:sz w:val="23"/>
-          <w:szCs w:val="23"/>
-        </w:rPr>
-      </w:pPr>
-      <w:r>
-        <w:rPr>
-          <w:rFonts w:ascii="Garamond" w:eastAsia="Garamond" w:hAnsi="Garamond" w:cs="Garamond"/>
-          <w:b/>
-          <w:sz w:val="23"/>
-          <w:szCs w:val="23"/>
-        </w:rPr>
-        <w:t>READING ASSIGNMENTS:</w:t>
+          <w:rFonts w:ascii="Garamond" w:hAnsi="Garamond"/>
+          <w:sz w:val="23"/>
+        </w:rPr>
+      </w:pPr>
+      <w:r>
+        <w:rPr>
+          <w:rFonts w:ascii="Garamond" w:hAnsi="Garamond"/>
+          <w:sz w:val="23"/>
+        </w:rPr>
+        <w:t>Students will present papers from the following five topic groups. Each group contains five readings — a textbook chapter plus published applications from top journals. Presentation assignments will be finalized before the first presentation week.</w:t>
       </w:r>
     </w:p>
     <w:p>
       <w:pPr>
         <w:rPr>
-          <w:rFonts w:eastAsia="Garamond"/>
+          <w:rFonts w:ascii="Garamond" w:eastAsia="Garamond" w:hAnsi="Garamond" w:cs="Garamond"/>
+          <w:b/>
+          <w:sz w:val="23"/>
+          <w:szCs w:val="23"/>
         </w:rPr>
       </w:pPr>
     </w:p>
     <w:p>
       <w:pPr>
+        <w:rPr>
+          <w:rFonts w:ascii="Garamond" w:eastAsia="Garamond" w:hAnsi="Garamond" w:cs="Garamond"/>
+          <w:b/>
+          <w:iCs/>
+          <w:sz w:val="23"/>
+          <w:szCs w:val="23"/>
+        </w:rPr>
+      </w:pPr>
+      <w:r>
+        <w:rPr>
+          <w:rFonts w:ascii="Garamond" w:hAnsi="Garamond"/>
+          <w:i/>
+          <w:sz w:val="23"/>
+        </w:rPr>
+        <w:t>Note:</w:t>
+      </w:r>
+      <w:r>
+        <w:rPr>
+          <w:rFonts w:ascii="Garamond" w:hAnsi="Garamond"/>
+          <w:iCs/>
+          <w:sz w:val="23"/>
+        </w:rPr>
+        <w:t xml:space="preserve"> If you have a top-journal paper that uses a method covered in one of these modules (e.g., a DiD paper for the DiD module) and you would prefer to present it instead, please contact the instructor before presentations begin to request a substitution.</w:t>
+      </w:r>
+    </w:p>
+    <w:p>
+      <w:pPr>
+        <w:rPr>
+          <w:rFonts w:eastAsia="Garamond"/>
+        </w:rPr>
+      </w:pPr>
+    </w:p>
+    <w:p>
+      <w:pPr>
         <w:spacing w:line="360" w:lineRule="auto"/>
         <w:jc w:val="both"/>
         <w:rPr>
@@ -10524,35 +11298,40 @@
       </w:pPr>
       <w:r>
         <w:rPr>
-          <w:rFonts w:eastAsia="Garamond"/>
+          <w:rFonts w:ascii="Garamond" w:eastAsia="Garamond" w:hAnsi="Garamond"/>
+          <w:sz w:val="23"/>
           <w:u w:val="single"/>
         </w:rPr>
         <w:t>1. R</w:t>
       </w:r>
       <w:r>
         <w:rPr>
-          <w:rFonts w:eastAsia="Garamond"/>
+          <w:rFonts w:ascii="Garamond" w:eastAsia="Garamond" w:hAnsi="Garamond"/>
+          <w:sz w:val="23"/>
           <w:u w:val="single"/>
         </w:rPr>
         <w:t xml:space="preserve">eading </w:t>
       </w:r>
       <w:r>
         <w:rPr>
-          <w:rFonts w:eastAsia="Garamond"/>
+          <w:rFonts w:ascii="Garamond" w:eastAsia="Garamond" w:hAnsi="Garamond"/>
+          <w:sz w:val="23"/>
           <w:u w:val="single"/>
         </w:rPr>
         <w:t>M</w:t>
       </w:r>
       <w:r>
         <w:rPr>
-          <w:rFonts w:eastAsia="Garamond"/>
+          <w:rFonts w:ascii="Garamond" w:eastAsia="Garamond" w:hAnsi="Garamond"/>
+          <w:sz w:val="23"/>
           <w:u w:val="single"/>
         </w:rPr>
         <w:t>aterials</w:t>
       </w:r>
       <w:r>
         <w:rPr>
-          <w:rFonts w:eastAsia="Garamond"/>
+          <w:rFonts w:ascii="Garamond" w:eastAsia="Garamond" w:hAnsi="Garamond"/>
+          <w:sz w:val="23"/>
           <w:u w:val="single"/>
         </w:rPr>
         <w:t xml:space="preserve"> for Field Experiments:</w:t>
@@ -10573,21 +11352,24 @@
       </w:pPr>
       <w:r>
         <w:rPr>
-          <w:rFonts w:eastAsia="Garamond"/>
+          <w:rFonts w:ascii="Garamond" w:eastAsia="Garamond" w:hAnsi="Garamond"/>
           <w:i/>
           <w:iCs/>
+          <w:sz w:val="23"/>
         </w:rPr>
         <w:t>Chapter 2. The Experimental Ideal</w:t>
       </w:r>
       <w:r>
         <w:rPr>
-          <w:rFonts w:eastAsia="Garamond"/>
+          <w:rFonts w:ascii="Garamond" w:eastAsia="Garamond" w:hAnsi="Garamond"/>
+          <w:sz w:val="23"/>
         </w:rPr>
         <w:t xml:space="preserve"> in </w:t>
       </w:r>
       <w:r>
         <w:rPr>
-          <w:rFonts w:eastAsia="Garamond"/>
+          <w:rFonts w:ascii="Garamond" w:eastAsia="Garamond" w:hAnsi="Garamond"/>
+          <w:sz w:val="23"/>
         </w:rPr>
         <w:t>Joshua D. Angrist &amp; Jörn-Steffen Pischke, 2009. "Mostly Harmless Econometrics: An Empiricist's Companion," Economics Books, Princeton University Press, edition 1, number 8769.</w:t>
       </w:r>
@@ -10607,21 +11389,24 @@
       </w:pPr>
       <w:r>
         <w:rPr>
-          <w:rFonts w:eastAsia="Garamond"/>
+          <w:rFonts w:ascii="Garamond" w:eastAsia="Garamond" w:hAnsi="Garamond"/>
+          <w:sz w:val="23"/>
         </w:rPr>
         <w:t xml:space="preserve">Elisa Montaguti, Scott A. </w:t>
       </w:r>
       <w:proofErr w:type="spellStart"/>
       <w:r>
         <w:rPr>
-          <w:rFonts w:eastAsia="Garamond"/>
+          <w:rFonts w:ascii="Garamond" w:eastAsia="Garamond" w:hAnsi="Garamond"/>
+          <w:sz w:val="23"/>
         </w:rPr>
         <w:t>Neslin</w:t>
       </w:r>
       <w:proofErr w:type="spellEnd"/>
       <w:r>
         <w:rPr>
-          <w:rFonts w:eastAsia="Garamond"/>
+          <w:rFonts w:ascii="Garamond" w:eastAsia="Garamond" w:hAnsi="Garamond"/>
+          <w:sz w:val="23"/>
         </w:rPr>
         <w:t>, Sara Valentini (2016) Can Marketing Campaigns Induce Multichannel Buying and More Profitable Customers? A Field Experiment. Marketing Science 35(2):201-217.</w:t>
       </w:r>
@@ -10641,7 +11426,8 @@
       </w:pPr>
       <w:r>
         <w:rPr>
-          <w:rFonts w:eastAsia="Garamond"/>
+          <w:rFonts w:ascii="Garamond" w:eastAsia="Garamond" w:hAnsi="Garamond"/>
+          <w:sz w:val="23"/>
         </w:rPr>
         <w:t>Navdeep S. Sahni, Dan Zou, Pradeep K. Chintagunta (2017) Do Targeted Discount Offers Serve as Advertising? Evidence from 70 Field Experiments. Management Science 63(8):2688-2705.</w:t>
       </w:r>
@@ -10661,9 +11447,9 @@
       </w:pPr>
       <w:r>
         <w:rPr>
-          <w:rFonts w:eastAsia="Garamond"/>
-        </w:rPr>
-        <w:lastRenderedPageBreak/>
+          <w:rFonts w:ascii="Garamond" w:eastAsia="Garamond" w:hAnsi="Garamond"/>
+          <w:sz w:val="23"/>
+        </w:rPr>
         <w:t>Bapna, Ravi, Jui Ramaprasad, Galit Shmueli, and Akhmed Umyarov. "One-way mirrors in online dating: A randomized field experiment." Management Science 62, no. 11 (2016): 3100-3122.</w:t>
       </w:r>
     </w:p>
@@ -10682,21 +11468,24 @@
       </w:pPr>
       <w:r>
         <w:rPr>
-          <w:rFonts w:eastAsia="Garamond"/>
+          <w:rFonts w:ascii="Garamond" w:eastAsia="Garamond" w:hAnsi="Garamond"/>
           <w:i/>
           <w:iCs/>
+          <w:sz w:val="23"/>
         </w:rPr>
         <w:t>Chapter 1. Experiments and Generalized Causal Inference</w:t>
       </w:r>
       <w:r>
         <w:rPr>
-          <w:rFonts w:eastAsia="Garamond"/>
+          <w:rFonts w:ascii="Garamond" w:eastAsia="Garamond" w:hAnsi="Garamond"/>
+          <w:sz w:val="23"/>
         </w:rPr>
         <w:t xml:space="preserve"> in </w:t>
       </w:r>
       <w:r>
         <w:rPr>
-          <w:rFonts w:eastAsia="Garamond"/>
+          <w:rFonts w:ascii="Garamond" w:eastAsia="Garamond" w:hAnsi="Garamond"/>
+          <w:sz w:val="23"/>
         </w:rPr>
         <w:t>Cook, Thomas D., Donald Thomas Campbell, and William Shadish. Experimental and quasi-experimental designs for generalized causal inference. Boston, MA: Houghton Mifflin, 2002.</w:t>
       </w:r>
@@ -10721,70 +11510,80 @@
       </w:pPr>
       <w:r>
         <w:rPr>
-          <w:rFonts w:eastAsia="Garamond"/>
+          <w:rFonts w:ascii="Garamond" w:eastAsia="Garamond" w:hAnsi="Garamond"/>
+          <w:sz w:val="23"/>
           <w:u w:val="single"/>
         </w:rPr>
         <w:t>2. R</w:t>
       </w:r>
       <w:r>
         <w:rPr>
-          <w:rFonts w:eastAsia="Garamond"/>
+          <w:rFonts w:ascii="Garamond" w:eastAsia="Garamond" w:hAnsi="Garamond"/>
+          <w:sz w:val="23"/>
           <w:u w:val="single"/>
         </w:rPr>
         <w:t xml:space="preserve">eading </w:t>
       </w:r>
       <w:r>
         <w:rPr>
-          <w:rFonts w:eastAsia="Garamond"/>
+          <w:rFonts w:ascii="Garamond" w:eastAsia="Garamond" w:hAnsi="Garamond"/>
+          <w:sz w:val="23"/>
           <w:u w:val="single"/>
         </w:rPr>
         <w:t>M</w:t>
       </w:r>
       <w:r>
         <w:rPr>
-          <w:rFonts w:eastAsia="Garamond"/>
+          <w:rFonts w:ascii="Garamond" w:eastAsia="Garamond" w:hAnsi="Garamond"/>
+          <w:sz w:val="23"/>
           <w:u w:val="single"/>
         </w:rPr>
         <w:t>aterials</w:t>
       </w:r>
       <w:r>
         <w:rPr>
-          <w:rFonts w:eastAsia="Garamond"/>
+          <w:rFonts w:ascii="Garamond" w:eastAsia="Garamond" w:hAnsi="Garamond"/>
+          <w:sz w:val="23"/>
           <w:u w:val="single"/>
         </w:rPr>
         <w:t xml:space="preserve"> for I</w:t>
       </w:r>
       <w:r>
         <w:rPr>
-          <w:rFonts w:eastAsia="Garamond"/>
+          <w:rFonts w:ascii="Garamond" w:eastAsia="Garamond" w:hAnsi="Garamond"/>
+          <w:sz w:val="23"/>
           <w:u w:val="single"/>
         </w:rPr>
         <w:t xml:space="preserve">nstrumental </w:t>
       </w:r>
       <w:r>
         <w:rPr>
-          <w:rFonts w:eastAsia="Garamond"/>
+          <w:rFonts w:ascii="Garamond" w:eastAsia="Garamond" w:hAnsi="Garamond"/>
+          <w:sz w:val="23"/>
           <w:u w:val="single"/>
         </w:rPr>
         <w:t>V</w:t>
       </w:r>
       <w:r>
         <w:rPr>
-          <w:rFonts w:eastAsia="Garamond"/>
+          <w:rFonts w:ascii="Garamond" w:eastAsia="Garamond" w:hAnsi="Garamond"/>
+          <w:sz w:val="23"/>
           <w:u w:val="single"/>
         </w:rPr>
         <w:t>ariables</w:t>
       </w:r>
       <w:r>
         <w:rPr>
-          <w:rFonts w:eastAsia="Garamond"/>
+          <w:rFonts w:ascii="Garamond" w:eastAsia="Garamond" w:hAnsi="Garamond"/>
+          <w:sz w:val="23"/>
           <w:u w:val="single"/>
         </w:rPr>
         <w:t xml:space="preserve"> (IVs)</w:t>
       </w:r>
       <w:r>
         <w:rPr>
-          <w:rFonts w:eastAsia="Garamond"/>
+          <w:rFonts w:ascii="Garamond" w:eastAsia="Garamond" w:hAnsi="Garamond"/>
+          <w:sz w:val="23"/>
           <w:u w:val="single"/>
         </w:rPr>
         <w:t>:</w:t>
@@ -10805,45 +11604,51 @@
       </w:pPr>
       <w:r>
         <w:rPr>
-          <w:rFonts w:eastAsia="Garamond"/>
+          <w:rFonts w:ascii="Garamond" w:eastAsia="Garamond" w:hAnsi="Garamond"/>
           <w:i/>
           <w:iCs/>
+          <w:sz w:val="23"/>
         </w:rPr>
         <w:t xml:space="preserve">Chapter </w:t>
       </w:r>
       <w:r>
         <w:rPr>
-          <w:rFonts w:eastAsia="Garamond"/>
+          <w:rFonts w:ascii="Garamond" w:eastAsia="Garamond" w:hAnsi="Garamond"/>
           <w:i/>
           <w:iCs/>
+          <w:sz w:val="23"/>
         </w:rPr>
         <w:t>4</w:t>
       </w:r>
       <w:r>
         <w:rPr>
-          <w:rFonts w:eastAsia="Garamond"/>
+          <w:rFonts w:ascii="Garamond" w:eastAsia="Garamond" w:hAnsi="Garamond"/>
           <w:i/>
           <w:iCs/>
+          <w:sz w:val="23"/>
         </w:rPr>
         <w:t xml:space="preserve">. </w:t>
       </w:r>
       <w:r>
         <w:rPr>
-          <w:rFonts w:eastAsia="Garamond"/>
+          <w:rFonts w:ascii="Garamond" w:eastAsia="Garamond" w:hAnsi="Garamond"/>
           <w:i/>
           <w:iCs/>
+          <w:sz w:val="23"/>
         </w:rPr>
         <w:t>Instrumental Variables in Action: Sometimes You Get What You Need</w:t>
       </w:r>
       <w:r>
         <w:rPr>
-          <w:rFonts w:eastAsia="Garamond"/>
+          <w:rFonts w:ascii="Garamond" w:eastAsia="Garamond" w:hAnsi="Garamond"/>
+          <w:sz w:val="23"/>
         </w:rPr>
         <w:t xml:space="preserve"> in </w:t>
       </w:r>
       <w:r>
         <w:rPr>
-          <w:rFonts w:eastAsia="Garamond"/>
+          <w:rFonts w:ascii="Garamond" w:eastAsia="Garamond" w:hAnsi="Garamond"/>
+          <w:sz w:val="23"/>
         </w:rPr>
         <w:t>Joshua D. Angrist &amp; Jörn-Steffen Pischke, 2009. "Mostly Harmless Econometrics: An Empiricist's Companion," Economics Books, Princeton University Press, edition 1, number 8769.</w:t>
       </w:r>
@@ -10863,23 +11668,10 @@
       </w:pPr>
       <w:r>
         <w:rPr>
-          <w:rFonts w:eastAsia="Garamond"/>
-        </w:rPr>
-        <w:t xml:space="preserve">Angrist, </w:t>
-      </w:r>
-      <w:proofErr w:type="spellStart"/>
-      <w:r>
-        <w:rPr>
-          <w:rFonts w:eastAsia="Garamond"/>
-        </w:rPr>
-        <w:t>Imbens</w:t>
-      </w:r>
-      <w:proofErr w:type="spellEnd"/>
-      <w:r>
-        <w:rPr>
-          <w:rFonts w:eastAsia="Garamond"/>
-        </w:rPr>
-        <w:t>, G. W., &amp; Rubin, D. B. (1996). Identification of Causal Effects Using Instrumental Variables. Journal of the American Statistical Association, 91(434), 444–455.</w:t>
+          <w:rFonts w:ascii="Garamond" w:eastAsia="Garamond" w:hAnsi="Garamond"/>
+          <w:sz w:val="23"/>
+        </w:rPr>
+        <w:t>Angrist, Imbens, G. W., &amp; Rubin, D. B. (1996). Identification of Causal Effects Using Instrumental Variables. Journal of the American Statistical Association, 91(434), 444–455.</w:t>
       </w:r>
     </w:p>
     <w:p>
@@ -10897,7 +11689,8 @@
       </w:pPr>
       <w:r>
         <w:rPr>
-          <w:rFonts w:eastAsia="Garamond"/>
+          <w:rFonts w:ascii="Garamond" w:eastAsia="Garamond" w:hAnsi="Garamond"/>
+          <w:sz w:val="23"/>
         </w:rPr>
         <w:t>Florian Zettelmeyer, Fiona Scott Morton, &amp; Jorge Silva-Risso. (2006). How the Internet Lowers Prices: Evidence from Matched Survey and Automobile Transaction Data. Journal of Marketing Research, 43(2), 168–181.</w:t>
       </w:r>
@@ -10917,7 +11710,8 @@
       </w:pPr>
       <w:r>
         <w:rPr>
-          <w:rFonts w:eastAsia="Garamond"/>
+          <w:rFonts w:ascii="Garamond" w:eastAsia="Garamond" w:hAnsi="Garamond"/>
+          <w:sz w:val="23"/>
         </w:rPr>
         <w:t>Dewan S, Ramaprasad J (2012) Research Note—Music Blogging, Online Sampling, and the Long Tail. Inf. Syst. Res. 23(3-part-2):1056–1067.</w:t>
       </w:r>
@@ -10937,21 +11731,25 @@
       </w:pPr>
       <w:r>
         <w:rPr>
-          <w:rFonts w:eastAsia="Garamond"/>
-        </w:rPr>
+          <w:rFonts w:ascii="Garamond" w:eastAsia="Garamond" w:hAnsi="Garamond"/>
+          <w:sz w:val="23"/>
+        </w:rPr>
+        <w:lastRenderedPageBreak/>
         <w:t xml:space="preserve">Barron, Kyle, Edward Kung, and Davide </w:t>
       </w:r>
       <w:proofErr w:type="spellStart"/>
       <w:r>
         <w:rPr>
-          <w:rFonts w:eastAsia="Garamond"/>
+          <w:rFonts w:ascii="Garamond" w:eastAsia="Garamond" w:hAnsi="Garamond"/>
+          <w:sz w:val="23"/>
         </w:rPr>
         <w:t>Proserpio</w:t>
       </w:r>
       <w:proofErr w:type="spellEnd"/>
       <w:r>
         <w:rPr>
-          <w:rFonts w:eastAsia="Garamond"/>
+          <w:rFonts w:ascii="Garamond" w:eastAsia="Garamond" w:hAnsi="Garamond"/>
+          <w:sz w:val="23"/>
         </w:rPr>
         <w:t>. "The effect of home-sharing on house prices and rents: Evidence from Airbnb." Marketing Science 40.1 (2021): 23-47.</w:t>
       </w:r>
@@ -10976,42 +11774,48 @@
       </w:pPr>
       <w:r>
         <w:rPr>
-          <w:rFonts w:eastAsia="Garamond"/>
+          <w:rFonts w:ascii="Garamond" w:eastAsia="Garamond" w:hAnsi="Garamond"/>
+          <w:sz w:val="23"/>
           <w:u w:val="single"/>
         </w:rPr>
         <w:t>3. R</w:t>
       </w:r>
       <w:r>
         <w:rPr>
-          <w:rFonts w:eastAsia="Garamond"/>
+          <w:rFonts w:ascii="Garamond" w:eastAsia="Garamond" w:hAnsi="Garamond"/>
+          <w:sz w:val="23"/>
           <w:u w:val="single"/>
         </w:rPr>
         <w:t xml:space="preserve">eading </w:t>
       </w:r>
       <w:r>
         <w:rPr>
-          <w:rFonts w:eastAsia="Garamond"/>
+          <w:rFonts w:ascii="Garamond" w:eastAsia="Garamond" w:hAnsi="Garamond"/>
+          <w:sz w:val="23"/>
           <w:u w:val="single"/>
         </w:rPr>
         <w:t>M</w:t>
       </w:r>
       <w:r>
         <w:rPr>
-          <w:rFonts w:eastAsia="Garamond"/>
+          <w:rFonts w:ascii="Garamond" w:eastAsia="Garamond" w:hAnsi="Garamond"/>
+          <w:sz w:val="23"/>
           <w:u w:val="single"/>
         </w:rPr>
         <w:t>aterials</w:t>
       </w:r>
       <w:r>
         <w:rPr>
-          <w:rFonts w:eastAsia="Garamond"/>
+          <w:rFonts w:ascii="Garamond" w:eastAsia="Garamond" w:hAnsi="Garamond"/>
+          <w:sz w:val="23"/>
           <w:u w:val="single"/>
         </w:rPr>
         <w:t xml:space="preserve"> for Difference in Differences (DiD)</w:t>
       </w:r>
       <w:r>
         <w:rPr>
-          <w:rFonts w:eastAsia="Garamond"/>
+          <w:rFonts w:ascii="Garamond" w:eastAsia="Garamond" w:hAnsi="Garamond"/>
+          <w:sz w:val="23"/>
           <w:u w:val="single"/>
         </w:rPr>
         <w:t>:</w:t>
@@ -11032,45 +11836,51 @@
       </w:pPr>
       <w:r>
         <w:rPr>
-          <w:rFonts w:eastAsia="Garamond"/>
+          <w:rFonts w:ascii="Garamond" w:eastAsia="Garamond" w:hAnsi="Garamond"/>
           <w:i/>
           <w:iCs/>
+          <w:sz w:val="23"/>
         </w:rPr>
         <w:t xml:space="preserve">Chapter </w:t>
       </w:r>
       <w:r>
         <w:rPr>
-          <w:rFonts w:eastAsia="Garamond"/>
+          <w:rFonts w:ascii="Garamond" w:eastAsia="Garamond" w:hAnsi="Garamond"/>
           <w:i/>
           <w:iCs/>
+          <w:sz w:val="23"/>
         </w:rPr>
         <w:t>5</w:t>
       </w:r>
       <w:r>
         <w:rPr>
-          <w:rFonts w:eastAsia="Garamond"/>
+          <w:rFonts w:ascii="Garamond" w:eastAsia="Garamond" w:hAnsi="Garamond"/>
           <w:i/>
           <w:iCs/>
+          <w:sz w:val="23"/>
         </w:rPr>
         <w:t xml:space="preserve">. </w:t>
       </w:r>
       <w:r>
         <w:rPr>
-          <w:rFonts w:eastAsia="Garamond"/>
+          <w:rFonts w:ascii="Garamond" w:eastAsia="Garamond" w:hAnsi="Garamond"/>
           <w:i/>
           <w:iCs/>
+          <w:sz w:val="23"/>
         </w:rPr>
         <w:t xml:space="preserve">Parallel Worlds: Fixed Effects, Difference-in-Differences, and Panel Data </w:t>
       </w:r>
       <w:r>
         <w:rPr>
-          <w:rFonts w:eastAsia="Garamond"/>
+          <w:rFonts w:ascii="Garamond" w:eastAsia="Garamond" w:hAnsi="Garamond"/>
+          <w:sz w:val="23"/>
         </w:rPr>
         <w:t xml:space="preserve">in </w:t>
       </w:r>
       <w:r>
         <w:rPr>
-          <w:rFonts w:eastAsia="Garamond"/>
+          <w:rFonts w:ascii="Garamond" w:eastAsia="Garamond" w:hAnsi="Garamond"/>
+          <w:sz w:val="23"/>
         </w:rPr>
         <w:t>Joshua D. Angrist &amp; Jörn-Steffen Pischke, 2009. "Mostly Harmless Econometrics: An Empiricist's Companion," Economics Books, Princeton University Press, edition 1, number 8769.</w:t>
       </w:r>
@@ -11090,7 +11900,8 @@
       </w:pPr>
       <w:r>
         <w:rPr>
-          <w:rFonts w:eastAsia="Garamond"/>
+          <w:rFonts w:ascii="Garamond" w:eastAsia="Garamond" w:hAnsi="Garamond"/>
+          <w:sz w:val="23"/>
         </w:rPr>
         <w:t>Bertrand, Marianne, Esther Duflo, and Sendhil Mullainathan. "How much should we trust differences-in-differences estimates?" The Quarterly journal of economics 119.1 (2004): 249-275.</w:t>
       </w:r>
@@ -11111,14 +11922,16 @@
       <w:proofErr w:type="spellStart"/>
       <w:r>
         <w:rPr>
-          <w:rFonts w:eastAsia="Garamond"/>
+          <w:rFonts w:ascii="Garamond" w:eastAsia="Garamond" w:hAnsi="Garamond"/>
+          <w:sz w:val="23"/>
         </w:rPr>
         <w:t>Dranove</w:t>
       </w:r>
       <w:proofErr w:type="spellEnd"/>
       <w:r>
         <w:rPr>
-          <w:rFonts w:eastAsia="Garamond"/>
+          <w:rFonts w:ascii="Garamond" w:eastAsia="Garamond" w:hAnsi="Garamond"/>
+          <w:sz w:val="23"/>
         </w:rPr>
         <w:t>, David, et al. "Is more information better? The effects of “report cards” on health care providers." Journal of political Economy 111.3 (2003): 555-588.</w:t>
       </w:r>
@@ -11138,7 +11951,8 @@
       </w:pPr>
       <w:r>
         <w:rPr>
-          <w:rFonts w:eastAsia="Garamond"/>
+          <w:rFonts w:ascii="Garamond" w:eastAsia="Garamond" w:hAnsi="Garamond"/>
+          <w:sz w:val="23"/>
         </w:rPr>
         <w:t>Goldfarb, Avi, and Catherine E. Tucker. "Conducting research with quasi-experiments: A guide for marketers." Rotman School of Management Working Paper 2420920 (2014).</w:t>
       </w:r>
@@ -11159,14 +11973,16 @@
       <w:proofErr w:type="spellStart"/>
       <w:r>
         <w:rPr>
-          <w:rFonts w:eastAsia="Garamond"/>
+          <w:rFonts w:ascii="Garamond" w:eastAsia="Garamond" w:hAnsi="Garamond"/>
+          <w:sz w:val="23"/>
         </w:rPr>
         <w:t>Foerderer</w:t>
       </w:r>
       <w:proofErr w:type="spellEnd"/>
       <w:r>
         <w:rPr>
-          <w:rFonts w:eastAsia="Garamond"/>
+          <w:rFonts w:ascii="Garamond" w:eastAsia="Garamond" w:hAnsi="Garamond"/>
+          <w:sz w:val="23"/>
         </w:rPr>
         <w:t>, Jens, Nele Lueker, and Armin Heinzl. "And the Winner Is…? The Desirable and Undesirable Effects of Platform Awards." Information Systems Research 32, no. 4 (2021): 1155-1172.</w:t>
       </w:r>
@@ -11191,56 +12007,64 @@
       </w:pPr>
       <w:r>
         <w:rPr>
-          <w:rFonts w:eastAsia="Garamond"/>
+          <w:rFonts w:ascii="Garamond" w:eastAsia="Garamond" w:hAnsi="Garamond"/>
+          <w:sz w:val="23"/>
           <w:u w:val="single"/>
         </w:rPr>
         <w:t>4. R</w:t>
       </w:r>
       <w:r>
         <w:rPr>
-          <w:rFonts w:eastAsia="Garamond"/>
+          <w:rFonts w:ascii="Garamond" w:eastAsia="Garamond" w:hAnsi="Garamond"/>
+          <w:sz w:val="23"/>
           <w:u w:val="single"/>
         </w:rPr>
         <w:t xml:space="preserve">eading </w:t>
       </w:r>
       <w:r>
         <w:rPr>
-          <w:rFonts w:eastAsia="Garamond"/>
+          <w:rFonts w:ascii="Garamond" w:eastAsia="Garamond" w:hAnsi="Garamond"/>
+          <w:sz w:val="23"/>
           <w:u w:val="single"/>
         </w:rPr>
         <w:t>M</w:t>
       </w:r>
       <w:r>
         <w:rPr>
-          <w:rFonts w:eastAsia="Garamond"/>
+          <w:rFonts w:ascii="Garamond" w:eastAsia="Garamond" w:hAnsi="Garamond"/>
+          <w:sz w:val="23"/>
           <w:u w:val="single"/>
         </w:rPr>
         <w:t>aterials</w:t>
       </w:r>
       <w:r>
         <w:rPr>
-          <w:rFonts w:eastAsia="Garamond"/>
+          <w:rFonts w:ascii="Garamond" w:eastAsia="Garamond" w:hAnsi="Garamond"/>
+          <w:sz w:val="23"/>
           <w:u w:val="single"/>
         </w:rPr>
         <w:t xml:space="preserve"> for M</w:t>
       </w:r>
       <w:r>
         <w:rPr>
-          <w:rFonts w:eastAsia="Garamond"/>
+          <w:rFonts w:ascii="Garamond" w:eastAsia="Garamond" w:hAnsi="Garamond"/>
+          <w:sz w:val="23"/>
           <w:u w:val="single"/>
         </w:rPr>
         <w:t xml:space="preserve">atching </w:t>
       </w:r>
       <w:r>
         <w:rPr>
-          <w:rFonts w:eastAsia="Garamond"/>
+          <w:rFonts w:ascii="Garamond" w:eastAsia="Garamond" w:hAnsi="Garamond"/>
+          <w:sz w:val="23"/>
           <w:u w:val="single"/>
         </w:rPr>
         <w:t>M</w:t>
       </w:r>
       <w:r>
         <w:rPr>
-          <w:rFonts w:eastAsia="Garamond"/>
+          <w:rFonts w:ascii="Garamond" w:eastAsia="Garamond" w:hAnsi="Garamond"/>
+          <w:sz w:val="23"/>
           <w:u w:val="single"/>
         </w:rPr>
         <w:t>ethods:</w:t>
@@ -11261,7 +12085,8 @@
       </w:pPr>
       <w:r>
         <w:rPr>
-          <w:rFonts w:eastAsia="Garamond"/>
+          <w:rFonts w:ascii="Garamond" w:eastAsia="Garamond" w:hAnsi="Garamond"/>
+          <w:sz w:val="23"/>
         </w:rPr>
         <w:t>Gordon, Brett R., et al. "A comparison of approaches to advertising measurement: Evidence from big field experiments at Facebook." Marketing Science 38.2 (2019): 193-225.</w:t>
       </w:r>
@@ -11281,22 +12106,24 @@
       </w:pPr>
       <w:r>
         <w:rPr>
-          <w:rFonts w:eastAsia="Garamond"/>
-        </w:rPr>
-        <w:lastRenderedPageBreak/>
+          <w:rFonts w:ascii="Garamond" w:eastAsia="Garamond" w:hAnsi="Garamond"/>
+          <w:sz w:val="23"/>
+        </w:rPr>
         <w:t xml:space="preserve">Xu, </w:t>
       </w:r>
       <w:proofErr w:type="spellStart"/>
       <w:r>
         <w:rPr>
-          <w:rFonts w:eastAsia="Garamond"/>
+          <w:rFonts w:ascii="Garamond" w:eastAsia="Garamond" w:hAnsi="Garamond"/>
+          <w:sz w:val="23"/>
         </w:rPr>
         <w:t>Kaiquan</w:t>
       </w:r>
       <w:proofErr w:type="spellEnd"/>
       <w:r>
         <w:rPr>
-          <w:rFonts w:eastAsia="Garamond"/>
+          <w:rFonts w:ascii="Garamond" w:eastAsia="Garamond" w:hAnsi="Garamond"/>
+          <w:sz w:val="23"/>
         </w:rPr>
         <w:t>, Jason Chan, Anindya Ghose, and Sang Pil Han. "Battle of the channels: The impact of tablets on digital commerce." Management Science 63, no. 5 (2017): 1469-1492.</w:t>
       </w:r>
@@ -11316,21 +12143,24 @@
       </w:pPr>
       <w:r>
         <w:rPr>
-          <w:rFonts w:eastAsia="Garamond"/>
+          <w:rFonts w:ascii="Garamond" w:eastAsia="Garamond" w:hAnsi="Garamond"/>
+          <w:sz w:val="23"/>
         </w:rPr>
         <w:t xml:space="preserve">Adamopoulos, Panagiotis, Vilma </w:t>
       </w:r>
       <w:proofErr w:type="spellStart"/>
       <w:r>
         <w:rPr>
-          <w:rFonts w:eastAsia="Garamond"/>
+          <w:rFonts w:ascii="Garamond" w:eastAsia="Garamond" w:hAnsi="Garamond"/>
+          <w:sz w:val="23"/>
         </w:rPr>
         <w:t>Todri</w:t>
       </w:r>
       <w:proofErr w:type="spellEnd"/>
       <w:r>
         <w:rPr>
-          <w:rFonts w:eastAsia="Garamond"/>
+          <w:rFonts w:ascii="Garamond" w:eastAsia="Garamond" w:hAnsi="Garamond"/>
+          <w:sz w:val="23"/>
         </w:rPr>
         <w:t>, and Anindya Ghose. "Demand effects of the Internet-of-things sales channel: Evidence from automating the purchase process." Information Systems Research 32.1 (2020): 238-267.</w:t>
       </w:r>
@@ -11350,7 +12180,8 @@
       </w:pPr>
       <w:r>
         <w:rPr>
-          <w:rFonts w:eastAsia="Garamond"/>
+          <w:rFonts w:ascii="Garamond" w:eastAsia="Garamond" w:hAnsi="Garamond"/>
+          <w:sz w:val="23"/>
         </w:rPr>
         <w:t>Kim, Jun Hyung, et al. "Home-tutoring services assisted with technology: Investigating the role of artificial intelligence using a randomized field experiment." Journal of Marketing Research (2021): 00222437211050351.</w:t>
       </w:r>
@@ -11370,35 +12201,56 @@
       </w:pPr>
       <w:r>
         <w:rPr>
-          <w:rFonts w:eastAsia="Garamond"/>
-        </w:rPr>
-        <w:t xml:space="preserve">Son, Yoonseock, </w:t>
+          <w:rFonts w:ascii="Garamond" w:eastAsia="Garamond" w:hAnsi="Garamond"/>
+          <w:sz w:val="23"/>
+        </w:rPr>
+        <w:t xml:space="preserve">Son, </w:t>
       </w:r>
       <w:proofErr w:type="spellStart"/>
       <w:r>
         <w:rPr>
-          <w:rFonts w:eastAsia="Garamond"/>
+          <w:rFonts w:ascii="Garamond" w:eastAsia="Garamond" w:hAnsi="Garamond"/>
+          <w:sz w:val="23"/>
+        </w:rPr>
+        <w:t>Yoonseock</w:t>
+      </w:r>
+      <w:proofErr w:type="spellEnd"/>
+      <w:r>
+        <w:rPr>
+          <w:rFonts w:ascii="Garamond" w:eastAsia="Garamond" w:hAnsi="Garamond"/>
+          <w:sz w:val="23"/>
+        </w:rPr>
+        <w:t xml:space="preserve">, </w:t>
+      </w:r>
+      <w:proofErr w:type="spellStart"/>
+      <w:r>
+        <w:rPr>
+          <w:rFonts w:ascii="Garamond" w:eastAsia="Garamond" w:hAnsi="Garamond"/>
+          <w:sz w:val="23"/>
         </w:rPr>
         <w:t>Wonseok</w:t>
       </w:r>
       <w:proofErr w:type="spellEnd"/>
       <w:r>
         <w:rPr>
-          <w:rFonts w:eastAsia="Garamond"/>
+          <w:rFonts w:ascii="Garamond" w:eastAsia="Garamond" w:hAnsi="Garamond"/>
+          <w:sz w:val="23"/>
         </w:rPr>
         <w:t xml:space="preserve"> Oh, Sang Pil Han, and </w:t>
       </w:r>
       <w:proofErr w:type="spellStart"/>
       <w:r>
         <w:rPr>
-          <w:rFonts w:eastAsia="Garamond"/>
+          <w:rFonts w:ascii="Garamond" w:eastAsia="Garamond" w:hAnsi="Garamond"/>
+          <w:sz w:val="23"/>
         </w:rPr>
         <w:t>Sungho</w:t>
       </w:r>
       <w:proofErr w:type="spellEnd"/>
       <w:r>
         <w:rPr>
-          <w:rFonts w:eastAsia="Garamond"/>
+          <w:rFonts w:ascii="Garamond" w:eastAsia="Garamond" w:hAnsi="Garamond"/>
+          <w:sz w:val="23"/>
         </w:rPr>
         <w:t xml:space="preserve"> Park. "When loyalty goes mobile: Effects of mobile loyalty apps on purchase, redemption, and competition." Information Systems Research 31, no. 3 (2020): 835-847.</w:t>
       </w:r>
@@ -11423,84 +12275,96 @@
       </w:pPr>
       <w:r>
         <w:rPr>
-          <w:rFonts w:eastAsia="Garamond"/>
+          <w:rFonts w:ascii="Garamond" w:eastAsia="Garamond" w:hAnsi="Garamond"/>
+          <w:sz w:val="23"/>
           <w:u w:val="single"/>
         </w:rPr>
         <w:t>5. R</w:t>
       </w:r>
       <w:r>
         <w:rPr>
-          <w:rFonts w:eastAsia="Garamond"/>
+          <w:rFonts w:ascii="Garamond" w:eastAsia="Garamond" w:hAnsi="Garamond"/>
+          <w:sz w:val="23"/>
           <w:u w:val="single"/>
         </w:rPr>
         <w:t xml:space="preserve">eading </w:t>
       </w:r>
       <w:r>
         <w:rPr>
-          <w:rFonts w:eastAsia="Garamond"/>
+          <w:rFonts w:ascii="Garamond" w:eastAsia="Garamond" w:hAnsi="Garamond"/>
+          <w:sz w:val="23"/>
           <w:u w:val="single"/>
         </w:rPr>
         <w:t>M</w:t>
       </w:r>
       <w:r>
         <w:rPr>
-          <w:rFonts w:eastAsia="Garamond"/>
+          <w:rFonts w:ascii="Garamond" w:eastAsia="Garamond" w:hAnsi="Garamond"/>
+          <w:sz w:val="23"/>
           <w:u w:val="single"/>
         </w:rPr>
         <w:t>aterials</w:t>
       </w:r>
       <w:r>
         <w:rPr>
-          <w:rFonts w:eastAsia="Garamond"/>
+          <w:rFonts w:ascii="Garamond" w:eastAsia="Garamond" w:hAnsi="Garamond"/>
+          <w:sz w:val="23"/>
           <w:u w:val="single"/>
         </w:rPr>
         <w:t xml:space="preserve"> for R</w:t>
       </w:r>
       <w:r>
         <w:rPr>
-          <w:rFonts w:eastAsia="Garamond"/>
+          <w:rFonts w:ascii="Garamond" w:eastAsia="Garamond" w:hAnsi="Garamond"/>
+          <w:sz w:val="23"/>
           <w:u w:val="single"/>
         </w:rPr>
         <w:t xml:space="preserve">egression </w:t>
       </w:r>
       <w:r>
         <w:rPr>
-          <w:rFonts w:eastAsia="Garamond"/>
+          <w:rFonts w:ascii="Garamond" w:eastAsia="Garamond" w:hAnsi="Garamond"/>
+          <w:sz w:val="23"/>
           <w:u w:val="single"/>
         </w:rPr>
         <w:t>D</w:t>
       </w:r>
       <w:r>
         <w:rPr>
-          <w:rFonts w:eastAsia="Garamond"/>
+          <w:rFonts w:ascii="Garamond" w:eastAsia="Garamond" w:hAnsi="Garamond"/>
+          <w:sz w:val="23"/>
           <w:u w:val="single"/>
         </w:rPr>
         <w:t xml:space="preserve">iscontinuity </w:t>
       </w:r>
       <w:r>
         <w:rPr>
-          <w:rFonts w:eastAsia="Garamond"/>
+          <w:rFonts w:ascii="Garamond" w:eastAsia="Garamond" w:hAnsi="Garamond"/>
+          <w:sz w:val="23"/>
           <w:u w:val="single"/>
         </w:rPr>
         <w:t>D</w:t>
       </w:r>
       <w:r>
         <w:rPr>
-          <w:rFonts w:eastAsia="Garamond"/>
+          <w:rFonts w:ascii="Garamond" w:eastAsia="Garamond" w:hAnsi="Garamond"/>
+          <w:sz w:val="23"/>
           <w:u w:val="single"/>
         </w:rPr>
         <w:t>esign</w:t>
       </w:r>
       <w:r>
         <w:rPr>
-          <w:rFonts w:eastAsia="Garamond"/>
+          <w:rFonts w:ascii="Garamond" w:eastAsia="Garamond" w:hAnsi="Garamond"/>
+          <w:sz w:val="23"/>
           <w:u w:val="single"/>
         </w:rPr>
         <w:t xml:space="preserve"> (RDD)</w:t>
       </w:r>
       <w:r>
         <w:rPr>
-          <w:rFonts w:eastAsia="Garamond"/>
+          <w:rFonts w:ascii="Garamond" w:eastAsia="Garamond" w:hAnsi="Garamond"/>
+          <w:sz w:val="23"/>
           <w:u w:val="single"/>
         </w:rPr>
         <w:t>:</w:t>
@@ -11521,45 +12385,52 @@
       </w:pPr>
       <w:r>
         <w:rPr>
-          <w:rFonts w:eastAsia="Garamond"/>
+          <w:rFonts w:ascii="Garamond" w:eastAsia="Garamond" w:hAnsi="Garamond"/>
           <w:i/>
           <w:iCs/>
-        </w:rPr>
+          <w:sz w:val="23"/>
+        </w:rPr>
+        <w:lastRenderedPageBreak/>
         <w:t xml:space="preserve">Chapter </w:t>
       </w:r>
       <w:r>
         <w:rPr>
-          <w:rFonts w:eastAsia="Garamond"/>
+          <w:rFonts w:ascii="Garamond" w:eastAsia="Garamond" w:hAnsi="Garamond"/>
           <w:i/>
           <w:iCs/>
+          <w:sz w:val="23"/>
         </w:rPr>
         <w:t>6</w:t>
       </w:r>
       <w:r>
         <w:rPr>
-          <w:rFonts w:eastAsia="Garamond"/>
+          <w:rFonts w:ascii="Garamond" w:eastAsia="Garamond" w:hAnsi="Garamond"/>
           <w:i/>
           <w:iCs/>
+          <w:sz w:val="23"/>
         </w:rPr>
         <w:t xml:space="preserve">. </w:t>
       </w:r>
       <w:r>
         <w:rPr>
-          <w:rFonts w:eastAsia="Garamond"/>
+          <w:rFonts w:ascii="Garamond" w:eastAsia="Garamond" w:hAnsi="Garamond"/>
           <w:i/>
           <w:iCs/>
+          <w:sz w:val="23"/>
         </w:rPr>
         <w:t xml:space="preserve">Getting a Little Jumpy: Regression Discontinuity Designs </w:t>
       </w:r>
       <w:r>
         <w:rPr>
-          <w:rFonts w:eastAsia="Garamond"/>
+          <w:rFonts w:ascii="Garamond" w:eastAsia="Garamond" w:hAnsi="Garamond"/>
+          <w:sz w:val="23"/>
         </w:rPr>
         <w:t xml:space="preserve">in </w:t>
       </w:r>
       <w:r>
         <w:rPr>
-          <w:rFonts w:eastAsia="Garamond"/>
+          <w:rFonts w:ascii="Garamond" w:eastAsia="Garamond" w:hAnsi="Garamond"/>
+          <w:sz w:val="23"/>
         </w:rPr>
         <w:t>Joshua D. Angrist &amp; Jörn-Steffen Pischke, 2009. "Mostly Harmless Econometrics: An Empiricist's Companion," Economics Books, Princeton University Press, edition 1, number 8769.</w:t>
       </w:r>
@@ -11579,7 +12450,8 @@
       </w:pPr>
       <w:r>
         <w:rPr>
-          <w:rFonts w:eastAsia="Garamond"/>
+          <w:rFonts w:ascii="Garamond" w:eastAsia="Garamond" w:hAnsi="Garamond"/>
+          <w:sz w:val="23"/>
         </w:rPr>
         <w:t>Caroline Flammer (2015) Does Corporate Social Responsibility Lead to Superior Financial Performance? A Regression Discontinuity Approach. Management Science 61(11):2549-2568.</w:t>
       </w:r>
@@ -11599,7 +12471,8 @@
       </w:pPr>
       <w:r>
         <w:rPr>
-          <w:rFonts w:eastAsia="Garamond"/>
+          <w:rFonts w:ascii="Garamond" w:eastAsia="Garamond" w:hAnsi="Garamond"/>
+          <w:sz w:val="23"/>
         </w:rPr>
         <w:t>Wesley Hartmann, Harikesh S. Nair, Sridhar Narayanan, (2011) Identifying Causal Marketing Mix Effects Using a Regression Discontinuity Design. Marketing Science 30(6):1079-1097.</w:t>
       </w:r>
@@ -11619,21 +12492,24 @@
       </w:pPr>
       <w:r>
         <w:rPr>
-          <w:rFonts w:eastAsia="Garamond"/>
+          <w:rFonts w:ascii="Garamond" w:eastAsia="Garamond" w:hAnsi="Garamond"/>
+          <w:sz w:val="23"/>
         </w:rPr>
         <w:t xml:space="preserve">Jo, </w:t>
       </w:r>
       <w:proofErr w:type="spellStart"/>
       <w:r>
         <w:rPr>
-          <w:rFonts w:eastAsia="Garamond"/>
+          <w:rFonts w:ascii="Garamond" w:eastAsia="Garamond" w:hAnsi="Garamond"/>
+          <w:sz w:val="23"/>
         </w:rPr>
         <w:t>Wooyong</w:t>
       </w:r>
       <w:proofErr w:type="spellEnd"/>
       <w:r>
         <w:rPr>
-          <w:rFonts w:eastAsia="Garamond"/>
+          <w:rFonts w:ascii="Garamond" w:eastAsia="Garamond" w:hAnsi="Garamond"/>
+          <w:sz w:val="23"/>
         </w:rPr>
         <w:t>, et al. "Protecting consumers from themselves: Assessing consequences of usage restriction laws on online game usage and spending." Marketing Science 39.1 (2020): 117-133.</w:t>
       </w:r>
@@ -11653,7 +12529,8 @@
       </w:pPr>
       <w:r>
         <w:rPr>
-          <w:rFonts w:eastAsia="Garamond"/>
+          <w:rFonts w:ascii="Garamond" w:eastAsia="Garamond" w:hAnsi="Garamond"/>
+          <w:sz w:val="23"/>
         </w:rPr>
         <w:t>Flammer, Caroline, and Pratima Bansal. "Does a long‐term orientation create value? Evidence from a regression discontinuity." Strategic Management Journal 38, no. 9 (2017): 1827-1847.</w:t>
       </w:r>
@@ -11711,7 +12588,8 @@
       </w:pPr>
       <w:r>
         <w:rPr>
-          <w:rFonts w:eastAsia="Garamond"/>
+          <w:rFonts w:ascii="Garamond" w:eastAsia="Garamond" w:hAnsi="Garamond"/>
+          <w:sz w:val="23"/>
         </w:rPr>
         <w:t>Holland, Paul W. "Statistics and causal inference." Journal of the American statistical Association 81, no. 396 (1986): 945-960.</w:t>
       </w:r>
@@ -11731,7 +12609,8 @@
       </w:pPr>
       <w:r>
         <w:rPr>
-          <w:rFonts w:eastAsia="Garamond"/>
+          <w:rFonts w:ascii="Garamond" w:eastAsia="Garamond" w:hAnsi="Garamond"/>
+          <w:sz w:val="23"/>
         </w:rPr>
         <w:t>Lin, Winston. "Agnostic notes on regression adjustments to experimental data: Reexamining Freedman’s critique." The Annals of Applied Statistics 7, no. 1 (2013): 295-318.</w:t>
       </w:r>
@@ -11751,7 +12630,8 @@
       </w:pPr>
       <w:r>
         <w:rPr>
-          <w:rFonts w:eastAsia="Garamond"/>
+          <w:rFonts w:ascii="Garamond" w:eastAsia="Garamond" w:hAnsi="Garamond"/>
+          <w:sz w:val="23"/>
         </w:rPr>
         <w:t>Freedman, David A. "On regression adjustments to experimental data." Advances in Applied Mathematics 40, no. 2 (2008): 180-193.</w:t>
       </w:r>
@@ -11771,13 +12651,15 @@
       </w:pPr>
       <w:r>
         <w:rPr>
-          <w:rFonts w:eastAsia="Garamond"/>
+          <w:rFonts w:ascii="Garamond" w:eastAsia="Garamond" w:hAnsi="Garamond"/>
+          <w:sz w:val="23"/>
         </w:rPr>
         <w:t xml:space="preserve">Stuart, Elizabeth A. "Matching methods for causal inference: A review and a look forward." Statistical science: a review journal of the Institute of Mathematical Statistics 25, no. 1 (2010): </w:t>
       </w:r>
       <w:r>
         <w:rPr>
-          <w:rFonts w:eastAsia="Garamond"/>
+          <w:rFonts w:ascii="Garamond" w:eastAsia="Garamond" w:hAnsi="Garamond"/>
+          <w:sz w:val="23"/>
         </w:rPr>
         <w:t>1-21.</w:t>
       </w:r>
@@ -11797,7 +12679,8 @@
       </w:pPr>
       <w:r>
         <w:rPr>
-          <w:rFonts w:eastAsia="Garamond"/>
+          <w:rFonts w:ascii="Garamond" w:eastAsia="Garamond" w:hAnsi="Garamond"/>
+          <w:sz w:val="23"/>
         </w:rPr>
         <w:t>Imai, Kosuke, and In Song Kim. "When should we use unit fixed effects regression models for causal inference with longitudinal data?" American Journal of Political Science 63, no. 2 (2019): 467-490.</w:t>
       </w:r>
@@ -11817,9 +12700,9 @@
       </w:pPr>
       <w:r>
         <w:rPr>
-          <w:rFonts w:eastAsia="Garamond"/>
-        </w:rPr>
-        <w:lastRenderedPageBreak/>
+          <w:rFonts w:ascii="Garamond" w:eastAsia="Garamond" w:hAnsi="Garamond"/>
+          <w:sz w:val="23"/>
+        </w:rPr>
         <w:t>Baker, Andrew C., David F. Larcker, and Charles CY Wang. "How much should we trust staggered difference-in-differences estimates?" Journal of Financial Economics 144, no. 2 (2022): 370-395.</w:t>
       </w:r>
     </w:p>
@@ -11838,23 +12721,10 @@
       </w:pPr>
       <w:r>
         <w:rPr>
-          <w:rFonts w:eastAsia="Garamond"/>
-        </w:rPr>
-        <w:t xml:space="preserve">Arkhangelsky, Dmitry, Susan Athey, David A. Hirshberg, Guido W. </w:t>
-      </w:r>
-      <w:proofErr w:type="spellStart"/>
-      <w:r>
-        <w:rPr>
-          <w:rFonts w:eastAsia="Garamond"/>
-        </w:rPr>
-        <w:t>Imbens</w:t>
-      </w:r>
-      <w:proofErr w:type="spellEnd"/>
-      <w:r>
-        <w:rPr>
-          <w:rFonts w:eastAsia="Garamond"/>
-        </w:rPr>
-        <w:t xml:space="preserve"> and Stefan Wager. 2021. "Synthetic Difference-in-Differences." American Economic Review, 111 (12): 4088–4118.</w:t>
+          <w:rFonts w:ascii="Garamond" w:eastAsia="Garamond" w:hAnsi="Garamond"/>
+          <w:sz w:val="23"/>
+        </w:rPr>
+        <w:t>Arkhangelsky, Dmitry, Susan Athey, David A. Hirshberg, Guido W. Imbens and Stefan Wager. 2021. "Synthetic Difference-in-Differences." American Economic Review, 111 (12): 4088–4118.</w:t>
       </w:r>
     </w:p>
     <w:p>
@@ -11872,7 +12742,8 @@
       </w:pPr>
       <w:r>
         <w:rPr>
-          <w:rFonts w:eastAsia="Garamond"/>
+          <w:rFonts w:ascii="Garamond" w:eastAsia="Garamond" w:hAnsi="Garamond"/>
+          <w:sz w:val="23"/>
         </w:rPr>
         <w:t xml:space="preserve">Goodman-Bacon, A. (2021). Difference-in-differences with variation in treatment timing. Journal of Econometrics, 225(2):254–277. </w:t>
       </w:r>
@@ -11892,31 +12763,35 @@
       </w:pPr>
       <w:r>
         <w:rPr>
+          <w:rFonts w:ascii="Garamond" w:eastAsia="Garamond" w:hAnsi="Garamond"/>
+          <w:sz w:val="23"/>
+        </w:rPr>
+        <w:t>Callaway, B. and Sant’Anna, P. H. (2021). Difference-in-differences with multiple time periods.</w:t>
+      </w:r>
+      <w:r>
+        <w:rPr>
           <w:rFonts w:eastAsia="Garamond"/>
         </w:rPr>
-        <w:t>Callaway, B. and Sant’Anna, P. H. (2021). Difference-in-differences with multiple time periods.</w:t>
-      </w:r>
-      <w:r>
-        <w:rPr>
-          <w:rFonts w:eastAsia="Garamond"/>
-        </w:rPr>
         <w:t xml:space="preserve"> </w:t>
       </w:r>
       <w:r>
         <w:rPr>
-          <w:rFonts w:eastAsia="Garamond"/>
+          <w:rFonts w:ascii="Garamond" w:eastAsia="Garamond" w:hAnsi="Garamond"/>
+          <w:sz w:val="23"/>
         </w:rPr>
         <w:t xml:space="preserve">Journal of </w:t>
       </w:r>
       <w:r>
         <w:rPr>
-          <w:rFonts w:eastAsia="Garamond"/>
+          <w:rFonts w:ascii="Garamond" w:eastAsia="Garamond" w:hAnsi="Garamond"/>
+          <w:sz w:val="23"/>
         </w:rPr>
         <w:t>E</w:t>
       </w:r>
       <w:r>
         <w:rPr>
-          <w:rFonts w:eastAsia="Garamond"/>
+          <w:rFonts w:ascii="Garamond" w:eastAsia="Garamond" w:hAnsi="Garamond"/>
+          <w:sz w:val="23"/>
         </w:rPr>
         <w:t>conometrics, 225(2):200–230.</w:t>
       </w:r>
@@ -11936,8 +12811,10 @@
       </w:pPr>
       <w:r>
         <w:rPr>
-          <w:rFonts w:eastAsia="Garamond"/>
-        </w:rPr>
+          <w:rFonts w:ascii="Garamond" w:eastAsia="Garamond" w:hAnsi="Garamond"/>
+          <w:sz w:val="23"/>
+        </w:rPr>
+        <w:lastRenderedPageBreak/>
         <w:t>Victor Chernozhukov, Denis Chetverikov, Mert Demirer, Esther Duflo, Christian Hansen, Whitney Newey, James Robins, Double/debiased machine learning for treatment and structural parameters, The Econometrics Journal, Volume 21, Issue 1, 1 February 2018, Pages C1–C68, https://doi.org/10.1111/ectj.12097</w:t>
       </w:r>
     </w:p>
@@ -11956,21 +12833,24 @@
       </w:pPr>
       <w:r>
         <w:rPr>
-          <w:rFonts w:eastAsia="Garamond"/>
+          <w:rFonts w:ascii="Garamond" w:eastAsia="Garamond" w:hAnsi="Garamond"/>
+          <w:sz w:val="23"/>
         </w:rPr>
         <w:t xml:space="preserve">Angrist, Joshua D., and Jörn-Steffen Pischke. 2017. "Undergraduate Econometrics Instruction: Through Our Classes, </w:t>
       </w:r>
       <w:proofErr w:type="gramStart"/>
       <w:r>
         <w:rPr>
-          <w:rFonts w:eastAsia="Garamond"/>
+          <w:rFonts w:ascii="Garamond" w:eastAsia="Garamond" w:hAnsi="Garamond"/>
+          <w:sz w:val="23"/>
         </w:rPr>
         <w:t>Darkly</w:t>
       </w:r>
       <w:proofErr w:type="gramEnd"/>
       <w:r>
         <w:rPr>
-          <w:rFonts w:eastAsia="Garamond"/>
+          <w:rFonts w:ascii="Garamond" w:eastAsia="Garamond" w:hAnsi="Garamond"/>
+          <w:sz w:val="23"/>
         </w:rPr>
         <w:t>." Journal of Economic Perspectives 31 (2): 125–44.</w:t>
       </w:r>
@@ -11990,7 +12870,8 @@
       </w:pPr>
       <w:r>
         <w:rPr>
-          <w:rFonts w:eastAsia="Garamond"/>
+          <w:rFonts w:ascii="Garamond" w:eastAsia="Garamond" w:hAnsi="Garamond"/>
+          <w:sz w:val="23"/>
         </w:rPr>
         <w:t>Angrist, Joshua D., and Jörn-Steffen Pischke. 2010. "The Credibility Revolution in Empirical Economics: How Better Research Design Is Taking the Con out of Econometrics." Journal of Economic Perspectives 24 (2): 3–30.</w:t>
       </w:r>
@@ -12348,6 +13229,116 @@
     </w:lvl>
   </w:abstractNum>
   <w:abstractNum w:abstractNumId="2" w15:restartNumberingAfterBreak="0">
+    <w:nsid w:val="0E18632F"/>
+    <w:multiLevelType w:val="multilevel"/>
+    <w:tmpl w:val="94FAA7D0"/>
+    <w:lvl w:ilvl="0">
+      <w:start w:val="1"/>
+      <w:numFmt w:val="decimal"/>
+      <w:lvlText w:val="%1."/>
+      <w:lvlJc w:val="left"/>
+      <w:pPr>
+        <w:ind w:left="720" w:hanging="360"/>
+      </w:pPr>
+      <w:rPr>
+        <w:u w:val="none"/>
+      </w:rPr>
+    </w:lvl>
+    <w:lvl w:ilvl="1">
+      <w:start w:val="1"/>
+      <w:numFmt w:val="lowerLetter"/>
+      <w:lvlText w:val="%2."/>
+      <w:lvlJc w:val="left"/>
+      <w:pPr>
+        <w:ind w:left="1440" w:hanging="360"/>
+      </w:pPr>
+      <w:rPr>
+        <w:u w:val="none"/>
+      </w:rPr>
+    </w:lvl>
+    <w:lvl w:ilvl="2">
+      <w:start w:val="1"/>
+      <w:numFmt w:val="lowerRoman"/>
+      <w:lvlText w:val="%3."/>
+      <w:lvlJc w:val="right"/>
+      <w:pPr>
+        <w:ind w:left="2160" w:hanging="360"/>
+      </w:pPr>
+      <w:rPr>
+        <w:u w:val="none"/>
+      </w:rPr>
+    </w:lvl>
+    <w:lvl w:ilvl="3">
+      <w:start w:val="1"/>
+      <w:numFmt w:val="decimal"/>
+      <w:lvlText w:val="%4."/>
+      <w:lvlJc w:val="left"/>
+      <w:pPr>
+        <w:ind w:left="2880" w:hanging="360"/>
+      </w:pPr>
+    </w:lvl>
+    <w:lvl w:ilvl="4">
+      <w:start w:val="1"/>
+      <w:numFmt w:val="lowerLetter"/>
+      <w:lvlText w:val="%5."/>
+      <w:lvlJc w:val="left"/>
+      <w:pPr>
+        <w:ind w:left="3600" w:hanging="360"/>
+      </w:pPr>
+      <w:rPr>
+        <w:u w:val="none"/>
+      </w:rPr>
+    </w:lvl>
+    <w:lvl w:ilvl="5">
+      <w:start w:val="1"/>
+      <w:numFmt w:val="lowerRoman"/>
+      <w:lvlText w:val="%6."/>
+      <w:lvlJc w:val="right"/>
+      <w:pPr>
+        <w:ind w:left="4320" w:hanging="360"/>
+      </w:pPr>
+      <w:rPr>
+        <w:u w:val="none"/>
+      </w:rPr>
+    </w:lvl>
+    <w:lvl w:ilvl="6">
+      <w:start w:val="1"/>
+      <w:numFmt w:val="decimal"/>
+      <w:lvlText w:val="%7."/>
+      <w:lvlJc w:val="left"/>
+      <w:pPr>
+        <w:ind w:left="5040" w:hanging="360"/>
+      </w:pPr>
+      <w:rPr>
+        <w:u w:val="none"/>
+      </w:rPr>
+    </w:lvl>
+    <w:lvl w:ilvl="7">
+      <w:start w:val="1"/>
+      <w:numFmt w:val="lowerLetter"/>
+      <w:lvlText w:val="%8."/>
+      <w:lvlJc w:val="left"/>
+      <w:pPr>
+        <w:ind w:left="5760" w:hanging="360"/>
+      </w:pPr>
+      <w:rPr>
+        <w:u w:val="none"/>
+      </w:rPr>
+    </w:lvl>
+    <w:lvl w:ilvl="8">
+      <w:start w:val="1"/>
+      <w:numFmt w:val="lowerRoman"/>
+      <w:lvlText w:val="%9."/>
+      <w:lvlJc w:val="right"/>
+      <w:pPr>
+        <w:ind w:left="6480" w:hanging="360"/>
+      </w:pPr>
+      <w:rPr>
+        <w:u w:val="none"/>
+      </w:rPr>
+    </w:lvl>
+  </w:abstractNum>
+  <w:abstractNum w:abstractNumId="3" w15:restartNumberingAfterBreak="0">
     <w:nsid w:val="113C6AA5"/>
     <w:multiLevelType w:val="hybridMultilevel"/>
     <w:tmpl w:val="F08E33EA"/>
@@ -12436,7 +13427,117 @@
       </w:pPr>
     </w:lvl>
   </w:abstractNum>
-  <w:abstractNum w:abstractNumId="3" w15:restartNumberingAfterBreak="0">
+  <w:abstractNum w:abstractNumId="4" w15:restartNumberingAfterBreak="0">
+    <w:nsid w:val="13363707"/>
+    <w:multiLevelType w:val="multilevel"/>
+    <w:tmpl w:val="94FAA7D0"/>
+    <w:lvl w:ilvl="0">
+      <w:start w:val="1"/>
+      <w:numFmt w:val="decimal"/>
+      <w:lvlText w:val="%1."/>
+      <w:lvlJc w:val="left"/>
+      <w:pPr>
+        <w:ind w:left="720" w:hanging="360"/>
+      </w:pPr>
+      <w:rPr>
+        <w:u w:val="none"/>
+      </w:rPr>
+    </w:lvl>
+    <w:lvl w:ilvl="1">
+      <w:start w:val="1"/>
+      <w:numFmt w:val="lowerLetter"/>
+      <w:lvlText w:val="%2."/>
+      <w:lvlJc w:val="left"/>
+      <w:pPr>
+        <w:ind w:left="1440" w:hanging="360"/>
+      </w:pPr>
+      <w:rPr>
+        <w:u w:val="none"/>
+      </w:rPr>
+    </w:lvl>
+    <w:lvl w:ilvl="2">
+      <w:start w:val="1"/>
+      <w:numFmt w:val="lowerRoman"/>
+      <w:lvlText w:val="%3."/>
+      <w:lvlJc w:val="right"/>
+      <w:pPr>
+        <w:ind w:left="2160" w:hanging="360"/>
+      </w:pPr>
+      <w:rPr>
+        <w:u w:val="none"/>
+      </w:rPr>
+    </w:lvl>
+    <w:lvl w:ilvl="3">
+      <w:start w:val="1"/>
+      <w:numFmt w:val="decimal"/>
+      <w:lvlText w:val="%4."/>
+      <w:lvlJc w:val="left"/>
+      <w:pPr>
+        <w:ind w:left="2880" w:hanging="360"/>
+      </w:pPr>
+    </w:lvl>
+    <w:lvl w:ilvl="4">
+      <w:start w:val="1"/>
+      <w:numFmt w:val="lowerLetter"/>
+      <w:lvlText w:val="%5."/>
+      <w:lvlJc w:val="left"/>
+      <w:pPr>
+        <w:ind w:left="3600" w:hanging="360"/>
+      </w:pPr>
+      <w:rPr>
+        <w:u w:val="none"/>
+      </w:rPr>
+    </w:lvl>
+    <w:lvl w:ilvl="5">
+      <w:start w:val="1"/>
+      <w:numFmt w:val="lowerRoman"/>
+      <w:lvlText w:val="%6."/>
+      <w:lvlJc w:val="right"/>
+      <w:pPr>
+        <w:ind w:left="4320" w:hanging="360"/>
+      </w:pPr>
+      <w:rPr>
+        <w:u w:val="none"/>
+      </w:rPr>
+    </w:lvl>
+    <w:lvl w:ilvl="6">
+      <w:start w:val="1"/>
+      <w:numFmt w:val="decimal"/>
+      <w:lvlText w:val="%7."/>
+      <w:lvlJc w:val="left"/>
+      <w:pPr>
+        <w:ind w:left="5040" w:hanging="360"/>
+      </w:pPr>
+      <w:rPr>
+        <w:u w:val="none"/>
+      </w:rPr>
+    </w:lvl>
+    <w:lvl w:ilvl="7">
+      <w:start w:val="1"/>
+      <w:numFmt w:val="lowerLetter"/>
+      <w:lvlText w:val="%8."/>
+      <w:lvlJc w:val="left"/>
+      <w:pPr>
+        <w:ind w:left="5760" w:hanging="360"/>
+      </w:pPr>
+      <w:rPr>
+        <w:u w:val="none"/>
+      </w:rPr>
+    </w:lvl>
+    <w:lvl w:ilvl="8">
+      <w:start w:val="1"/>
+      <w:numFmt w:val="lowerRoman"/>
+      <w:lvlText w:val="%9."/>
+      <w:lvlJc w:val="right"/>
+      <w:pPr>
+        <w:ind w:left="6480" w:hanging="360"/>
+      </w:pPr>
+      <w:rPr>
+        <w:u w:val="none"/>
+      </w:rPr>
+    </w:lvl>
+  </w:abstractNum>
+  <w:abstractNum w:abstractNumId="5" w15:restartNumberingAfterBreak="0">
     <w:nsid w:val="15440DA2"/>
     <w:multiLevelType w:val="hybridMultilevel"/>
     <w:tmpl w:val="8C5C18C4"/>
@@ -12525,7 +13626,7 @@
       </w:pPr>
     </w:lvl>
   </w:abstractNum>
-  <w:abstractNum w:abstractNumId="4" w15:restartNumberingAfterBreak="0">
+  <w:abstractNum w:abstractNumId="6" w15:restartNumberingAfterBreak="0">
     <w:nsid w:val="16031806"/>
     <w:multiLevelType w:val="hybridMultilevel"/>
     <w:tmpl w:val="DB3C44AC"/>
@@ -12614,7 +13715,7 @@
       </w:pPr>
     </w:lvl>
   </w:abstractNum>
-  <w:abstractNum w:abstractNumId="5" w15:restartNumberingAfterBreak="0">
+  <w:abstractNum w:abstractNumId="7" w15:restartNumberingAfterBreak="0">
     <w:nsid w:val="1EE436D7"/>
     <w:multiLevelType w:val="hybridMultilevel"/>
     <w:tmpl w:val="7C64ADF6"/>
@@ -12703,7 +13804,7 @@
       </w:pPr>
     </w:lvl>
   </w:abstractNum>
-  <w:abstractNum w:abstractNumId="6" w15:restartNumberingAfterBreak="0">
+  <w:abstractNum w:abstractNumId="8" w15:restartNumberingAfterBreak="0">
     <w:nsid w:val="1F6E7199"/>
     <w:multiLevelType w:val="multilevel"/>
     <w:tmpl w:val="A6E65D3A"/>
@@ -12852,7 +13953,7 @@
       </w:rPr>
     </w:lvl>
   </w:abstractNum>
-  <w:abstractNum w:abstractNumId="7" w15:restartNumberingAfterBreak="0">
+  <w:abstractNum w:abstractNumId="9" w15:restartNumberingAfterBreak="0">
     <w:nsid w:val="22AB4456"/>
     <w:multiLevelType w:val="hybridMultilevel"/>
     <w:tmpl w:val="57667CF6"/>
@@ -12941,7 +14042,7 @@
       </w:pPr>
     </w:lvl>
   </w:abstractNum>
-  <w:abstractNum w:abstractNumId="8" w15:restartNumberingAfterBreak="0">
+  <w:abstractNum w:abstractNumId="10" w15:restartNumberingAfterBreak="0">
     <w:nsid w:val="23D13EDE"/>
     <w:multiLevelType w:val="hybridMultilevel"/>
     <w:tmpl w:val="C974E754"/>
@@ -13031,7 +14132,7 @@
       </w:pPr>
     </w:lvl>
   </w:abstractNum>
-  <w:abstractNum w:abstractNumId="9" w15:restartNumberingAfterBreak="0">
+  <w:abstractNum w:abstractNumId="11" w15:restartNumberingAfterBreak="0">
     <w:nsid w:val="29584516"/>
     <w:multiLevelType w:val="multilevel"/>
     <w:tmpl w:val="61BCD9F8"/>
@@ -13144,7 +14245,7 @@
       </w:rPr>
     </w:lvl>
   </w:abstractNum>
-  <w:abstractNum w:abstractNumId="10" w15:restartNumberingAfterBreak="0">
+  <w:abstractNum w:abstractNumId="12" w15:restartNumberingAfterBreak="0">
     <w:nsid w:val="2BE47385"/>
     <w:multiLevelType w:val="multilevel"/>
     <w:tmpl w:val="07CC843A"/>
@@ -13293,7 +14394,7 @@
       </w:rPr>
     </w:lvl>
   </w:abstractNum>
-  <w:abstractNum w:abstractNumId="11" w15:restartNumberingAfterBreak="0">
+  <w:abstractNum w:abstractNumId="13" w15:restartNumberingAfterBreak="0">
     <w:nsid w:val="30AD1E5F"/>
     <w:multiLevelType w:val="hybridMultilevel"/>
     <w:tmpl w:val="AF827C72"/>
@@ -13382,7 +14483,7 @@
       </w:pPr>
     </w:lvl>
   </w:abstractNum>
-  <w:abstractNum w:abstractNumId="12" w15:restartNumberingAfterBreak="0">
+  <w:abstractNum w:abstractNumId="14" w15:restartNumberingAfterBreak="0">
     <w:nsid w:val="31217513"/>
     <w:multiLevelType w:val="multilevel"/>
     <w:tmpl w:val="666A78F4"/>
@@ -13531,7 +14632,7 @@
       </w:rPr>
     </w:lvl>
   </w:abstractNum>
-  <w:abstractNum w:abstractNumId="13" w15:restartNumberingAfterBreak="0">
+  <w:abstractNum w:abstractNumId="15" w15:restartNumberingAfterBreak="0">
     <w:nsid w:val="33655ABB"/>
     <w:multiLevelType w:val="hybridMultilevel"/>
     <w:tmpl w:val="2110A818"/>
@@ -13644,7 +14745,7 @@
       </w:rPr>
     </w:lvl>
   </w:abstractNum>
-  <w:abstractNum w:abstractNumId="14" w15:restartNumberingAfterBreak="0">
+  <w:abstractNum w:abstractNumId="16" w15:restartNumberingAfterBreak="0">
     <w:nsid w:val="339A5B4B"/>
     <w:multiLevelType w:val="multilevel"/>
     <w:tmpl w:val="4EC2026A"/>
@@ -13793,7 +14894,7 @@
       </w:rPr>
     </w:lvl>
   </w:abstractNum>
-  <w:abstractNum w:abstractNumId="15" w15:restartNumberingAfterBreak="0">
+  <w:abstractNum w:abstractNumId="17" w15:restartNumberingAfterBreak="0">
     <w:nsid w:val="34694EE4"/>
     <w:multiLevelType w:val="hybridMultilevel"/>
     <w:tmpl w:val="FDD0DC9A"/>
@@ -13883,7 +14984,7 @@
       </w:pPr>
     </w:lvl>
   </w:abstractNum>
-  <w:abstractNum w:abstractNumId="16" w15:restartNumberingAfterBreak="0">
+  <w:abstractNum w:abstractNumId="18" w15:restartNumberingAfterBreak="0">
     <w:nsid w:val="35E67F6D"/>
     <w:multiLevelType w:val="hybridMultilevel"/>
     <w:tmpl w:val="8C504152"/>
@@ -13972,7 +15073,7 @@
       </w:pPr>
     </w:lvl>
   </w:abstractNum>
-  <w:abstractNum w:abstractNumId="17" w15:restartNumberingAfterBreak="0">
+  <w:abstractNum w:abstractNumId="19" w15:restartNumberingAfterBreak="0">
     <w:nsid w:val="3BD47886"/>
     <w:multiLevelType w:val="multilevel"/>
     <w:tmpl w:val="96B2D65C"/>
@@ -14086,7 +15187,7 @@
       </w:rPr>
     </w:lvl>
   </w:abstractNum>
-  <w:abstractNum w:abstractNumId="18" w15:restartNumberingAfterBreak="0">
+  <w:abstractNum w:abstractNumId="20" w15:restartNumberingAfterBreak="0">
     <w:nsid w:val="3C0B2A9F"/>
     <w:multiLevelType w:val="multilevel"/>
     <w:tmpl w:val="AE5C9F16"/>
@@ -14235,7 +15336,7 @@
       </w:rPr>
     </w:lvl>
   </w:abstractNum>
-  <w:abstractNum w:abstractNumId="19" w15:restartNumberingAfterBreak="0">
+  <w:abstractNum w:abstractNumId="21" w15:restartNumberingAfterBreak="0">
     <w:nsid w:val="43E72E41"/>
     <w:multiLevelType w:val="hybridMultilevel"/>
     <w:tmpl w:val="5E7AFCCE"/>
@@ -14324,7 +15425,7 @@
       </w:pPr>
     </w:lvl>
   </w:abstractNum>
-  <w:abstractNum w:abstractNumId="20" w15:restartNumberingAfterBreak="0">
+  <w:abstractNum w:abstractNumId="22" w15:restartNumberingAfterBreak="0">
     <w:nsid w:val="443F580F"/>
     <w:multiLevelType w:val="hybridMultilevel"/>
     <w:tmpl w:val="260E569E"/>
@@ -14410,7 +15511,7 @@
       </w:pPr>
     </w:lvl>
   </w:abstractNum>
-  <w:abstractNum w:abstractNumId="21" w15:restartNumberingAfterBreak="0">
+  <w:abstractNum w:abstractNumId="23" w15:restartNumberingAfterBreak="0">
     <w:nsid w:val="45AB71EE"/>
     <w:multiLevelType w:val="hybridMultilevel"/>
     <w:tmpl w:val="FDD0DC9A"/>
@@ -14500,7 +15601,7 @@
       </w:pPr>
     </w:lvl>
   </w:abstractNum>
-  <w:abstractNum w:abstractNumId="22" w15:restartNumberingAfterBreak="0">
+  <w:abstractNum w:abstractNumId="24" w15:restartNumberingAfterBreak="0">
     <w:nsid w:val="4C5109CB"/>
     <w:multiLevelType w:val="multilevel"/>
     <w:tmpl w:val="A9188930"/>
@@ -14649,7 +15750,7 @@
       </w:rPr>
     </w:lvl>
   </w:abstractNum>
-  <w:abstractNum w:abstractNumId="23" w15:restartNumberingAfterBreak="0">
+  <w:abstractNum w:abstractNumId="25" w15:restartNumberingAfterBreak="0">
     <w:nsid w:val="4C6F7CFB"/>
     <w:multiLevelType w:val="hybridMultilevel"/>
     <w:tmpl w:val="AD20122E"/>
@@ -14738,7 +15839,7 @@
       </w:pPr>
     </w:lvl>
   </w:abstractNum>
-  <w:abstractNum w:abstractNumId="24" w15:restartNumberingAfterBreak="0">
+  <w:abstractNum w:abstractNumId="26" w15:restartNumberingAfterBreak="0">
     <w:nsid w:val="4E75334F"/>
     <w:multiLevelType w:val="hybridMultilevel"/>
     <w:tmpl w:val="5E7AFCCE"/>
@@ -14827,7 +15928,7 @@
       </w:pPr>
     </w:lvl>
   </w:abstractNum>
-  <w:abstractNum w:abstractNumId="25" w15:restartNumberingAfterBreak="0">
+  <w:abstractNum w:abstractNumId="27" w15:restartNumberingAfterBreak="0">
     <w:nsid w:val="501D4019"/>
     <w:multiLevelType w:val="multilevel"/>
     <w:tmpl w:val="90BAC6AA"/>
@@ -14941,7 +16042,7 @@
       </w:rPr>
     </w:lvl>
   </w:abstractNum>
-  <w:abstractNum w:abstractNumId="26" w15:restartNumberingAfterBreak="0">
+  <w:abstractNum w:abstractNumId="28" w15:restartNumberingAfterBreak="0">
     <w:nsid w:val="504356DD"/>
     <w:multiLevelType w:val="hybridMultilevel"/>
     <w:tmpl w:val="8A1CECE2"/>
@@ -15030,7 +16131,7 @@
       </w:pPr>
     </w:lvl>
   </w:abstractNum>
-  <w:abstractNum w:abstractNumId="27" w15:restartNumberingAfterBreak="0">
+  <w:abstractNum w:abstractNumId="29" w15:restartNumberingAfterBreak="0">
     <w:nsid w:val="50772511"/>
     <w:multiLevelType w:val="multilevel"/>
     <w:tmpl w:val="5B461EB8"/>
@@ -15179,7 +16280,7 @@
       </w:rPr>
     </w:lvl>
   </w:abstractNum>
-  <w:abstractNum w:abstractNumId="28" w15:restartNumberingAfterBreak="0">
+  <w:abstractNum w:abstractNumId="30" w15:restartNumberingAfterBreak="0">
     <w:nsid w:val="5556082E"/>
     <w:multiLevelType w:val="hybridMultilevel"/>
     <w:tmpl w:val="14BA8E74"/>
@@ -15265,7 +16366,7 @@
       </w:pPr>
     </w:lvl>
   </w:abstractNum>
-  <w:abstractNum w:abstractNumId="29" w15:restartNumberingAfterBreak="0">
+  <w:abstractNum w:abstractNumId="31" w15:restartNumberingAfterBreak="0">
     <w:nsid w:val="591079A9"/>
     <w:multiLevelType w:val="hybridMultilevel"/>
     <w:tmpl w:val="17FA55FE"/>
@@ -15378,7 +16479,7 @@
       </w:rPr>
     </w:lvl>
   </w:abstractNum>
-  <w:abstractNum w:abstractNumId="30" w15:restartNumberingAfterBreak="0">
+  <w:abstractNum w:abstractNumId="32" w15:restartNumberingAfterBreak="0">
     <w:nsid w:val="59F54CFE"/>
     <w:multiLevelType w:val="hybridMultilevel"/>
     <w:tmpl w:val="C930BD6C"/>
@@ -15467,7 +16568,7 @@
       </w:pPr>
     </w:lvl>
   </w:abstractNum>
-  <w:abstractNum w:abstractNumId="31" w15:restartNumberingAfterBreak="0">
+  <w:abstractNum w:abstractNumId="33" w15:restartNumberingAfterBreak="0">
     <w:nsid w:val="5C474929"/>
     <w:multiLevelType w:val="multilevel"/>
     <w:tmpl w:val="02443A24"/>
@@ -15616,7 +16717,7 @@
       </w:rPr>
     </w:lvl>
   </w:abstractNum>
-  <w:abstractNum w:abstractNumId="32" w15:restartNumberingAfterBreak="0">
+  <w:abstractNum w:abstractNumId="34" w15:restartNumberingAfterBreak="0">
     <w:nsid w:val="5EB761CA"/>
     <w:multiLevelType w:val="hybridMultilevel"/>
     <w:tmpl w:val="8A1CECE2"/>
@@ -15705,7 +16806,7 @@
       </w:pPr>
     </w:lvl>
   </w:abstractNum>
-  <w:abstractNum w:abstractNumId="33" w15:restartNumberingAfterBreak="0">
+  <w:abstractNum w:abstractNumId="35" w15:restartNumberingAfterBreak="0">
     <w:nsid w:val="5FBB4634"/>
     <w:multiLevelType w:val="hybridMultilevel"/>
     <w:tmpl w:val="4516F224"/>
@@ -15794,7 +16895,7 @@
       </w:pPr>
     </w:lvl>
   </w:abstractNum>
-  <w:abstractNum w:abstractNumId="34" w15:restartNumberingAfterBreak="0">
+  <w:abstractNum w:abstractNumId="36" w15:restartNumberingAfterBreak="0">
     <w:nsid w:val="61972404"/>
     <w:multiLevelType w:val="hybridMultilevel"/>
     <w:tmpl w:val="C686A67A"/>
@@ -15883,7 +16984,7 @@
       </w:pPr>
     </w:lvl>
   </w:abstractNum>
-  <w:abstractNum w:abstractNumId="35" w15:restartNumberingAfterBreak="0">
+  <w:abstractNum w:abstractNumId="37" w15:restartNumberingAfterBreak="0">
     <w:nsid w:val="68B0643D"/>
     <w:multiLevelType w:val="hybridMultilevel"/>
     <w:tmpl w:val="5E7AFCCE"/>
@@ -15972,7 +17073,7 @@
       </w:pPr>
     </w:lvl>
   </w:abstractNum>
-  <w:abstractNum w:abstractNumId="36" w15:restartNumberingAfterBreak="0">
+  <w:abstractNum w:abstractNumId="38" w15:restartNumberingAfterBreak="0">
     <w:nsid w:val="6B6B4848"/>
     <w:multiLevelType w:val="multilevel"/>
     <w:tmpl w:val="906AC392"/>
@@ -16121,7 +17222,7 @@
       </w:rPr>
     </w:lvl>
   </w:abstractNum>
-  <w:abstractNum w:abstractNumId="37" w15:restartNumberingAfterBreak="0">
+  <w:abstractNum w:abstractNumId="39" w15:restartNumberingAfterBreak="0">
     <w:nsid w:val="6F6A7803"/>
     <w:multiLevelType w:val="multilevel"/>
     <w:tmpl w:val="CF00ABD4"/>
@@ -16270,7 +17371,7 @@
       </w:rPr>
     </w:lvl>
   </w:abstractNum>
-  <w:abstractNum w:abstractNumId="38" w15:restartNumberingAfterBreak="0">
+  <w:abstractNum w:abstractNumId="40" w15:restartNumberingAfterBreak="0">
     <w:nsid w:val="71FD579B"/>
     <w:multiLevelType w:val="multilevel"/>
     <w:tmpl w:val="4C663B66"/>
@@ -16419,7 +17520,7 @@
       </w:rPr>
     </w:lvl>
   </w:abstractNum>
-  <w:abstractNum w:abstractNumId="39" w15:restartNumberingAfterBreak="0">
+  <w:abstractNum w:abstractNumId="41" w15:restartNumberingAfterBreak="0">
     <w:nsid w:val="77BE7BA4"/>
     <w:multiLevelType w:val="multilevel"/>
     <w:tmpl w:val="4E3EF74E"/>
@@ -16568,7 +17669,7 @@
       </w:rPr>
     </w:lvl>
   </w:abstractNum>
-  <w:abstractNum w:abstractNumId="40" w15:restartNumberingAfterBreak="0">
+  <w:abstractNum w:abstractNumId="42" w15:restartNumberingAfterBreak="0">
     <w:nsid w:val="7FE83063"/>
     <w:multiLevelType w:val="hybridMultilevel"/>
     <w:tmpl w:val="8A1CECE2"/>
@@ -16657,7 +17758,7 @@
       </w:pPr>
     </w:lvl>
   </w:abstractNum>
-  <w:abstractNum w:abstractNumId="41" w15:restartNumberingAfterBreak="0">
+  <w:abstractNum w:abstractNumId="43" w15:restartNumberingAfterBreak="0">
     <w:nsid w:val="7FF10FBA"/>
     <w:multiLevelType w:val="hybridMultilevel"/>
     <w:tmpl w:val="260E569E"/>
@@ -16744,130 +17845,136 @@
     </w:lvl>
   </w:abstractNum>
   <w:num w:numId="1" w16cid:durableId="266623402">
+    <w:abstractNumId w:val="11"/>
+  </w:num>
+  <w:num w:numId="2" w16cid:durableId="1980919078">
+    <w:abstractNumId w:val="19"/>
+  </w:num>
+  <w:num w:numId="3" w16cid:durableId="1253781852">
+    <w:abstractNumId w:val="6"/>
+  </w:num>
+  <w:num w:numId="4" w16cid:durableId="509562460">
+    <w:abstractNumId w:val="3"/>
+  </w:num>
+  <w:num w:numId="5" w16cid:durableId="244267483">
+    <w:abstractNumId w:val="36"/>
+  </w:num>
+  <w:num w:numId="6" w16cid:durableId="1686788498">
+    <w:abstractNumId w:val="7"/>
+  </w:num>
+  <w:num w:numId="7" w16cid:durableId="1340044388">
+    <w:abstractNumId w:val="27"/>
+  </w:num>
+  <w:num w:numId="8" w16cid:durableId="734816256">
+    <w:abstractNumId w:val="23"/>
+  </w:num>
+  <w:num w:numId="9" w16cid:durableId="1710690320">
+    <w:abstractNumId w:val="16"/>
+  </w:num>
+  <w:num w:numId="10" w16cid:durableId="1736200876">
+    <w:abstractNumId w:val="17"/>
+  </w:num>
+  <w:num w:numId="11" w16cid:durableId="1495489392">
+    <w:abstractNumId w:val="10"/>
+  </w:num>
+  <w:num w:numId="12" w16cid:durableId="393939510">
+    <w:abstractNumId w:val="35"/>
+  </w:num>
+  <w:num w:numId="13" w16cid:durableId="1830638471">
+    <w:abstractNumId w:val="13"/>
+  </w:num>
+  <w:num w:numId="14" w16cid:durableId="2003195017">
+    <w:abstractNumId w:val="32"/>
+  </w:num>
+  <w:num w:numId="15" w16cid:durableId="1114178436">
+    <w:abstractNumId w:val="15"/>
+  </w:num>
+  <w:num w:numId="16" w16cid:durableId="1631786536">
+    <w:abstractNumId w:val="43"/>
+  </w:num>
+  <w:num w:numId="17" w16cid:durableId="1511722969">
+    <w:abstractNumId w:val="30"/>
+  </w:num>
+  <w:num w:numId="18" w16cid:durableId="14892895">
+    <w:abstractNumId w:val="22"/>
+  </w:num>
+  <w:num w:numId="19" w16cid:durableId="1225025061">
+    <w:abstractNumId w:val="18"/>
+  </w:num>
+  <w:num w:numId="20" w16cid:durableId="1908030338">
+    <w:abstractNumId w:val="31"/>
+  </w:num>
+  <w:num w:numId="21" w16cid:durableId="371273715">
     <w:abstractNumId w:val="9"/>
   </w:num>
-  <w:num w:numId="2" w16cid:durableId="1980919078">
-    <w:abstractNumId w:val="17"/>
+  <w:num w:numId="22" w16cid:durableId="657729906">
+    <w:abstractNumId w:val="5"/>
   </w:num>
-  <w:num w:numId="3" w16cid:durableId="1253781852">
-    <w:abstractNumId w:val="4"/>
-  </w:num>
-  <w:num w:numId="4" w16cid:durableId="509562460">
-    <w:abstractNumId w:val="2"/>
-  </w:num>
-  <w:num w:numId="5" w16cid:durableId="244267483">
+  <w:num w:numId="23" w16cid:durableId="791437171">
     <w:abstractNumId w:val="34"/>
   </w:num>
-  <w:num w:numId="6" w16cid:durableId="1686788498">
-    <w:abstractNumId w:val="5"/>
-  </w:num>
-  <w:num w:numId="7" w16cid:durableId="1340044388">
-    <w:abstractNumId w:val="25"/>
-  </w:num>
-  <w:num w:numId="8" w16cid:durableId="734816256">
-    <w:abstractNumId w:val="21"/>
-  </w:num>
-  <w:num w:numId="9" w16cid:durableId="1710690320">
-    <w:abstractNumId w:val="14"/>
-  </w:num>
-  <w:num w:numId="10" w16cid:durableId="1736200876">
-    <w:abstractNumId w:val="15"/>
-  </w:num>
-  <w:num w:numId="11" w16cid:durableId="1495489392">
-    <w:abstractNumId w:val="8"/>
-  </w:num>
-  <w:num w:numId="12" w16cid:durableId="393939510">
-    <w:abstractNumId w:val="33"/>
-  </w:num>
-  <w:num w:numId="13" w16cid:durableId="1830638471">
-    <w:abstractNumId w:val="11"/>
-  </w:num>
-  <w:num w:numId="14" w16cid:durableId="2003195017">
-    <w:abstractNumId w:val="30"/>
-  </w:num>
-  <w:num w:numId="15" w16cid:durableId="1114178436">
-    <w:abstractNumId w:val="13"/>
-  </w:num>
-  <w:num w:numId="16" w16cid:durableId="1631786536">
-    <w:abstractNumId w:val="41"/>
-  </w:num>
-  <w:num w:numId="17" w16cid:durableId="1511722969">
+  <w:num w:numId="24" w16cid:durableId="316735751">
     <w:abstractNumId w:val="28"/>
   </w:num>
-  <w:num w:numId="18" w16cid:durableId="14892895">
-    <w:abstractNumId w:val="20"/>
-  </w:num>
-  <w:num w:numId="19" w16cid:durableId="1225025061">
-    <w:abstractNumId w:val="16"/>
-  </w:num>
-  <w:num w:numId="20" w16cid:durableId="1908030338">
-    <w:abstractNumId w:val="29"/>
-  </w:num>
-  <w:num w:numId="21" w16cid:durableId="371273715">
-    <w:abstractNumId w:val="7"/>
-  </w:num>
-  <w:num w:numId="22" w16cid:durableId="657729906">
-    <w:abstractNumId w:val="3"/>
-  </w:num>
-  <w:num w:numId="23" w16cid:durableId="791437171">
-    <w:abstractNumId w:val="32"/>
-  </w:num>
-  <w:num w:numId="24" w16cid:durableId="316735751">
-    <w:abstractNumId w:val="26"/>
-  </w:num>
   <w:num w:numId="25" w16cid:durableId="1902329085">
-    <w:abstractNumId w:val="40"/>
+    <w:abstractNumId w:val="42"/>
   </w:num>
   <w:num w:numId="26" w16cid:durableId="174271409">
     <w:abstractNumId w:val="1"/>
   </w:num>
   <w:num w:numId="27" w16cid:durableId="1163741000">
+    <w:abstractNumId w:val="14"/>
+  </w:num>
+  <w:num w:numId="28" w16cid:durableId="837234615">
+    <w:abstractNumId w:val="21"/>
+  </w:num>
+  <w:num w:numId="29" w16cid:durableId="1311398180">
+    <w:abstractNumId w:val="20"/>
+  </w:num>
+  <w:num w:numId="30" w16cid:durableId="1804152276">
+    <w:abstractNumId w:val="25"/>
+  </w:num>
+  <w:num w:numId="31" w16cid:durableId="1617909136">
+    <w:abstractNumId w:val="29"/>
+  </w:num>
+  <w:num w:numId="32" w16cid:durableId="1315061221">
+    <w:abstractNumId w:val="24"/>
+  </w:num>
+  <w:num w:numId="33" w16cid:durableId="1338656471">
+    <w:abstractNumId w:val="37"/>
+  </w:num>
+  <w:num w:numId="34" w16cid:durableId="2036419070">
+    <w:abstractNumId w:val="33"/>
+  </w:num>
+  <w:num w:numId="35" w16cid:durableId="128863779">
     <w:abstractNumId w:val="12"/>
   </w:num>
-  <w:num w:numId="28" w16cid:durableId="837234615">
-    <w:abstractNumId w:val="19"/>
-  </w:num>
-  <w:num w:numId="29" w16cid:durableId="1311398180">
-    <w:abstractNumId w:val="18"/>
-  </w:num>
-  <w:num w:numId="30" w16cid:durableId="1804152276">
-    <w:abstractNumId w:val="23"/>
-  </w:num>
-  <w:num w:numId="31" w16cid:durableId="1617909136">
-    <w:abstractNumId w:val="27"/>
-  </w:num>
-  <w:num w:numId="32" w16cid:durableId="1315061221">
-    <w:abstractNumId w:val="22"/>
-  </w:num>
-  <w:num w:numId="33" w16cid:durableId="1338656471">
-    <w:abstractNumId w:val="35"/>
-  </w:num>
-  <w:num w:numId="34" w16cid:durableId="2036419070">
-    <w:abstractNumId w:val="31"/>
-  </w:num>
-  <w:num w:numId="35" w16cid:durableId="128863779">
-    <w:abstractNumId w:val="10"/>
-  </w:num>
   <w:num w:numId="36" w16cid:durableId="173418312">
-    <w:abstractNumId w:val="39"/>
+    <w:abstractNumId w:val="41"/>
   </w:num>
   <w:num w:numId="37" w16cid:durableId="666792007">
-    <w:abstractNumId w:val="24"/>
+    <w:abstractNumId w:val="26"/>
   </w:num>
   <w:num w:numId="38" w16cid:durableId="868030234">
-    <w:abstractNumId w:val="37"/>
+    <w:abstractNumId w:val="39"/>
   </w:num>
   <w:num w:numId="39" w16cid:durableId="1626236744">
     <w:abstractNumId w:val="0"/>
   </w:num>
   <w:num w:numId="40" w16cid:durableId="490026371">
+    <w:abstractNumId w:val="40"/>
+  </w:num>
+  <w:num w:numId="41" w16cid:durableId="901258042">
     <w:abstractNumId w:val="38"/>
   </w:num>
-  <w:num w:numId="41" w16cid:durableId="901258042">
-    <w:abstractNumId w:val="36"/>
+  <w:num w:numId="42" w16cid:durableId="81414484">
+    <w:abstractNumId w:val="8"/>
   </w:num>
-  <w:num w:numId="42" w16cid:durableId="81414484">
-    <w:abstractNumId w:val="6"/>
+  <w:num w:numId="43" w16cid:durableId="1177621319">
+    <w:abstractNumId w:val="2"/>
+  </w:num>
+  <w:num w:numId="44" w16cid:durableId="1032340187">
+    <w:abstractNumId w:val="4"/>
   </w:num>
 </w:numbering>
 </file>

</xml_diff>

<commit_message>
Deploying to gh-pages from @ j1yoo/j1yoo.github.io@047302b5b662c941de642f1eeef01116993d5b8d 🚀
</commit_message>
<xml_diff>
--- a/assets/courses/eci/Spring 2026_Syllabus_ECI.docx
+++ b/assets/courses/eci/Spring 2026_Syllabus_ECI.docx
@@ -1278,10 +1278,29 @@
       </w:pPr>
       <w:r>
         <w:rPr>
-          <w:rFonts w:ascii="Garamond" w:hAnsi="Garamond"/>
-          <w:sz w:val="23"/>
-        </w:rPr>
-        <w:t>ISS5077 Computational Statistics for Data Science (CSDS) covers hypothesis testing, regression, and applied statistical modeling; ideal preparation for this course.</w:t>
+          <w:rFonts w:ascii="Garamond" w:eastAsia="Garamond" w:hAnsi="Garamond" w:cs="Garamond"/>
+        </w:rPr>
+        <w:t xml:space="preserve">ISS5066 Programming for Business Analytics (PBA) covers statistical inference, R programming, and an introduction to causal inference including potential outcomes </w:t>
+      </w:r>
+      <w:r>
+        <w:rPr>
+          <w:rFonts w:ascii="Garamond" w:eastAsia="Garamond" w:hAnsi="Garamond" w:cs="Garamond"/>
+        </w:rPr>
+        <w:lastRenderedPageBreak/>
+        <w:t>and difference-in-differences</w:t>
+      </w:r>
+      <w:r>
+        <w:rPr>
+          <w:rFonts w:ascii="Garamond" w:eastAsia="Garamond" w:hAnsi="Garamond" w:cs="Garamond" w:hint="eastAsia"/>
+          <w:lang w:eastAsia="ko-KR"/>
+        </w:rPr>
+        <w:t>,</w:t>
+      </w:r>
+      <w:r>
+        <w:rPr>
+          <w:rFonts w:ascii="Garamond" w:eastAsia="Garamond" w:hAnsi="Garamond" w:cs="Garamond"/>
+        </w:rPr>
+        <w:t xml:space="preserve"> all directly relevant to ECI. ECI goes considerably deeper, with more formal notation and careful assumption-based reasoning. Students entering with PBA will find the foundational concepts familiar, but should expect to engage more rigorously with the underlying theory. Qualified undergraduates and graduate students from other departments are welcome to join the class.</w:t>
       </w:r>
     </w:p>
     <w:p>
@@ -1296,11 +1315,9 @@
       </w:pPr>
       <w:r>
         <w:rPr>
-          <w:rFonts w:ascii="Garamond" w:hAnsi="Garamond"/>
-          <w:sz w:val="23"/>
-        </w:rPr>
-        <w:lastRenderedPageBreak/>
-        <w:t>ECON3033 Econometrics I and ECON3034 Econometrics II — regression methodology and empirical research designs.</w:t>
+          <w:rFonts w:ascii="Garamond" w:eastAsia="Garamond" w:hAnsi="Garamond" w:cs="Garamond"/>
+        </w:rPr>
+        <w:t>ISS5077 Computational Statistics for Data Science (CSDS) covers hypothesis testing, regression, and applied statistical modeling and will provide a strong background for the statistical foundations covered in this course.</w:t>
       </w:r>
     </w:p>
     <w:p>
@@ -1315,10 +1332,43 @@
       </w:pPr>
       <w:r>
         <w:rPr>
-          <w:rFonts w:ascii="Garamond" w:hAnsi="Garamond"/>
-          <w:sz w:val="23"/>
-        </w:rPr>
-        <w:t>ISS5066 Programming for Business Analytics (PBA) covers regression, statistical inference, and R programming, but students entering with PBA alone should expect a steeper learning curve.</w:t>
+          <w:rFonts w:ascii="Garamond" w:eastAsia="Garamond" w:hAnsi="Garamond" w:cs="Garamond"/>
+        </w:rPr>
+        <w:t>ISS5090 Business Analytics with Machine Learning (BAML) covers supervised and unsupervised learning methods including trees, random forests, and neural networks and will provide helpful background for the causal ML topics covered in Weeks 14</w:t>
+      </w:r>
+      <w:r>
+        <w:rPr>
+          <w:rFonts w:ascii="Garamond" w:eastAsia="Garamond" w:hAnsi="Garamond" w:cs="Garamond" w:hint="eastAsia"/>
+          <w:lang w:eastAsia="ko-KR"/>
+        </w:rPr>
+        <w:t xml:space="preserve"> - </w:t>
+      </w:r>
+      <w:r>
+        <w:rPr>
+          <w:rFonts w:ascii="Garamond" w:eastAsia="Garamond" w:hAnsi="Garamond" w:cs="Garamond"/>
+        </w:rPr>
+        <w:t>15.</w:t>
+      </w:r>
+    </w:p>
+    <w:p>
+      <w:pPr>
+        <w:numPr>
+          <w:ilvl w:val="0"/>
+          <w:numId w:val="7"/>
+        </w:numPr>
+        <w:rPr>
+          <w:rFonts w:ascii="Garamond" w:eastAsia="Garamond" w:hAnsi="Garamond" w:cs="Garamond"/>
+          <w:b/>
+          <w:bCs/>
+        </w:rPr>
+      </w:pPr>
+      <w:r>
+        <w:rPr>
+          <w:rFonts w:ascii="Garamond" w:eastAsia="Garamond" w:hAnsi="Garamond" w:cs="Garamond"/>
+          <w:b/>
+          <w:bCs/>
+        </w:rPr>
+        <w:t>Related coursework in other departments:</w:t>
       </w:r>
     </w:p>
     <w:p>
@@ -1333,38 +1383,26 @@
       </w:pPr>
       <w:r>
         <w:rPr>
-          <w:rFonts w:ascii="Garamond" w:hAnsi="Garamond"/>
-          <w:sz w:val="23"/>
-        </w:rPr>
-        <w:t>ISS5090 Business Analytics with Machine Learning (BAML) relevant background for the causal ML topics covered in Weeks 14–15.</w:t>
+          <w:rFonts w:ascii="Garamond" w:eastAsia="Garamond" w:hAnsi="Garamond" w:cs="Garamond"/>
+        </w:rPr>
+        <w:t>ECON3033 Econometrics I and ECON3034 Econometrics II — regression methodology and empirical research designs.</w:t>
       </w:r>
     </w:p>
     <w:p>
       <w:pPr>
-        <w:ind w:left="720"/>
-        <w:rPr>
-          <w:rFonts w:ascii="Batang" w:eastAsia="Batang" w:hAnsi="Batang" w:cs="Batang" w:hint="eastAsia"/>
-          <w:i/>
-          <w:lang w:eastAsia="ko-KR"/>
-        </w:rPr>
-      </w:pPr>
-      <w:r>
-        <w:rPr>
-          <w:rFonts w:ascii="Garamond" w:hAnsi="Garamond"/>
-          <w:iCs/>
-          <w:sz w:val="6"/>
-          <w:szCs w:val="6"/>
-          <w:lang w:eastAsia="ko-KR"/>
-        </w:rPr>
-        <w:br/>
-      </w:r>
-      <w:r>
-        <w:rPr>
-          <w:rFonts w:ascii="Garamond" w:hAnsi="Garamond"/>
-          <w:i/>
-          <w:sz w:val="23"/>
-        </w:rPr>
-        <w:t>Students may also be interested in ECON5099 Causal Inference in Econometrics, which covers related topics.</w:t>
+        <w:numPr>
+          <w:ilvl w:val="1"/>
+          <w:numId w:val="7"/>
+        </w:numPr>
+        <w:rPr>
+          <w:rFonts w:ascii="Garamond" w:eastAsia="Garamond" w:hAnsi="Garamond" w:cs="Garamond" w:hint="eastAsia"/>
+        </w:rPr>
+      </w:pPr>
+      <w:r>
+        <w:rPr>
+          <w:rFonts w:ascii="Garamond" w:eastAsia="Garamond" w:hAnsi="Garamond" w:cs="Garamond"/>
+        </w:rPr>
+        <w:t>ECON5099 Causal Inference in Econometrics covers related topics.</w:t>
       </w:r>
     </w:p>
     <w:p>
@@ -2468,6 +2506,7 @@
           <w:sz w:val="23"/>
           <w:szCs w:val="23"/>
         </w:rPr>
+        <w:lastRenderedPageBreak/>
         <w:t>Manski, Charles F. 1995.</w:t>
       </w:r>
       <w:r>
@@ -2656,7 +2695,6 @@
           <w:b/>
           <w:sz w:val="23"/>
         </w:rPr>
-        <w:lastRenderedPageBreak/>
         <w:t>SOFTWARE:</w:t>
       </w:r>
     </w:p>
@@ -2722,6 +2760,7 @@
         </w:rPr>
         <w:t xml:space="preserve">, </w:t>
       </w:r>
+      <w:proofErr w:type="spellStart"/>
       <w:r>
         <w:rPr>
           <w:rFonts w:ascii="Lucida Console" w:hAnsi="Lucida Console"/>
@@ -2730,6 +2769,7 @@
         </w:rPr>
         <w:t>rdrobust</w:t>
       </w:r>
+      <w:proofErr w:type="spellEnd"/>
       <w:r>
         <w:rPr>
           <w:rFonts w:ascii="Garamond" w:hAnsi="Garamond"/>
@@ -2737,6 +2777,7 @@
         </w:rPr>
         <w:t xml:space="preserve">, </w:t>
       </w:r>
+      <w:proofErr w:type="spellStart"/>
       <w:r>
         <w:rPr>
           <w:rFonts w:ascii="Lucida Console" w:hAnsi="Lucida Console"/>
@@ -2745,6 +2786,7 @@
         </w:rPr>
         <w:t>MatchIt</w:t>
       </w:r>
+      <w:proofErr w:type="spellEnd"/>
       <w:r>
         <w:rPr>
           <w:rFonts w:ascii="Garamond" w:hAnsi="Garamond"/>
@@ -2752,6 +2794,7 @@
         </w:rPr>
         <w:t xml:space="preserve">, </w:t>
       </w:r>
+      <w:proofErr w:type="spellStart"/>
       <w:r>
         <w:rPr>
           <w:rFonts w:ascii="Lucida Console" w:hAnsi="Lucida Console"/>
@@ -2760,6 +2803,7 @@
         </w:rPr>
         <w:t>WeightIt</w:t>
       </w:r>
+      <w:proofErr w:type="spellEnd"/>
       <w:r>
         <w:rPr>
           <w:rFonts w:ascii="Garamond" w:hAnsi="Garamond"/>
@@ -3864,6 +3908,7 @@
           <w:sz w:val="23"/>
           <w:szCs w:val="23"/>
         </w:rPr>
+        <w:lastRenderedPageBreak/>
         <w:t>Proper Attribution:</w:t>
       </w:r>
       <w:r>
@@ -3966,16 +4011,7 @@
           <w:sz w:val="23"/>
           <w:szCs w:val="23"/>
         </w:rPr>
-        <w:t xml:space="preserve">All work submitted for academic evaluation must be the student’s own. The penalty for violation of academic integrity will result in a zero for that </w:t>
-      </w:r>
-      <w:r>
-        <w:rPr>
-          <w:rFonts w:ascii="Garamond" w:eastAsia="Garamond" w:hAnsi="Garamond" w:cs="Garamond"/>
-          <w:sz w:val="23"/>
-          <w:szCs w:val="23"/>
-        </w:rPr>
-        <w:lastRenderedPageBreak/>
-        <w:t xml:space="preserve">assignment for the first time. Subsequent </w:t>
+        <w:t xml:space="preserve">All work submitted for academic evaluation must be the student’s own. The penalty for violation of academic integrity will result in a zero for that assignment for the first time. Subsequent </w:t>
       </w:r>
       <w:r>
         <w:rPr>
@@ -4938,7 +4974,6 @@
           <w:rFonts w:ascii="Garamond" w:hAnsi="Garamond"/>
           <w:sz w:val="23"/>
         </w:rPr>
-        <w:lastRenderedPageBreak/>
         <w:t>Parameters of Interest</w:t>
       </w:r>
       <w:r>
@@ -5591,6 +5626,7 @@
           <w:u w:val="single"/>
           <w:lang w:eastAsia="zh-CN"/>
         </w:rPr>
+        <w:lastRenderedPageBreak/>
         <w:t>required to give feedback on another group’s project</w:t>
       </w:r>
       <w:r>
@@ -7012,13 +7048,6 @@
               </w:rPr>
               <w:t>Due: Problem Set 1 (Potential Outcomes); The Effect CH. 3 Describing Variables</w:t>
             </w:r>
-            <w:r>
-              <w:rPr>
-                <w:i/>
-                <w:sz w:val="20"/>
-                <w:szCs w:val="20"/>
-              </w:rPr>
-            </w:r>
           </w:p>
         </w:tc>
         <w:tc>
@@ -7768,23 +7797,6 @@
               </w:rPr>
               <w:t>Due: Problem Set 3 (Inference for the ATE); The Effect CH. 13 Regression; Project Proposal</w:t>
             </w:r>
-            <w:r>
-              <w:rPr>
-                <w:i/>
-                <w:sz w:val="20"/>
-                <w:szCs w:val="20"/>
-              </w:rPr>
-            </w:r>
-            <w:r>
-              <w:rPr>
-                <w:b/>
-                <w:bCs/>
-                <w:i/>
-                <w:color w:val="7030A0"/>
-                <w:sz w:val="20"/>
-                <w:szCs w:val="20"/>
-              </w:rPr>
-            </w:r>
           </w:p>
         </w:tc>
         <w:tc>
@@ -9172,30 +9184,6 @@
                 <w:sz w:val="20"/>
               </w:rPr>
               <w:t>Due: Problem Set 5 (Instrumental Variables); The Effect CH. 19 Instrumental Variables; Progress Report</w:t>
-            </w:r>
-            <w:r>
-              <w:rPr>
-                <w:i/>
-                <w:sz w:val="20"/>
-                <w:szCs w:val="20"/>
-              </w:rPr>
-            </w:r>
-            <w:r>
-              <w:rPr>
-                <w:i/>
-                <w:sz w:val="20"/>
-                <w:szCs w:val="20"/>
-              </w:rPr>
-            </w:r>
-            <w:r>
-              <w:rPr>
-                <w:b/>
-                <w:bCs/>
-                <w:i/>
-                <w:color w:val="7030A0"/>
-                <w:sz w:val="20"/>
-                <w:szCs w:val="20"/>
-              </w:rPr>
             </w:r>
           </w:p>
         </w:tc>
@@ -10896,16 +10884,6 @@
               </w:rPr>
               <w:t>Due: The Effect CH. 20 Regression Discontinuity; Final Report</w:t>
             </w:r>
-            <w:r>
-              <w:rPr>
-                <w:b/>
-                <w:bCs/>
-                <w:i/>
-                <w:color w:val="7030A0"/>
-                <w:sz w:val="20"/>
-                <w:szCs w:val="20"/>
-              </w:rPr>
-            </w:r>
           </w:p>
         </w:tc>
         <w:tc>
@@ -11224,7 +11202,6 @@
           <w:sz w:val="23"/>
           <w:szCs w:val="23"/>
         </w:rPr>
-        <w:lastRenderedPageBreak/>
         <w:t>READING ASSIGNMENTS:</w:t>
       </w:r>
     </w:p>
@@ -11240,6 +11217,7 @@
           <w:rFonts w:ascii="Garamond" w:hAnsi="Garamond"/>
           <w:sz w:val="23"/>
         </w:rPr>
+        <w:lastRenderedPageBreak/>
         <w:t>Students will present papers from the following five topic groups. Each group contains five readings — a textbook chapter plus published applications from top journals. Presentation assignments will be finalized before the first presentation week.</w:t>
       </w:r>
     </w:p>
@@ -11734,7 +11712,6 @@
           <w:rFonts w:ascii="Garamond" w:eastAsia="Garamond" w:hAnsi="Garamond"/>
           <w:sz w:val="23"/>
         </w:rPr>
-        <w:lastRenderedPageBreak/>
         <w:t xml:space="preserve">Barron, Kyle, Edward Kung, and Davide </w:t>
       </w:r>
       <w:proofErr w:type="spellStart"/>
@@ -12204,23 +12181,7 @@
           <w:rFonts w:ascii="Garamond" w:eastAsia="Garamond" w:hAnsi="Garamond"/>
           <w:sz w:val="23"/>
         </w:rPr>
-        <w:t xml:space="preserve">Son, </w:t>
-      </w:r>
-      <w:proofErr w:type="spellStart"/>
-      <w:r>
-        <w:rPr>
-          <w:rFonts w:ascii="Garamond" w:eastAsia="Garamond" w:hAnsi="Garamond"/>
-          <w:sz w:val="23"/>
-        </w:rPr>
-        <w:t>Yoonseock</w:t>
-      </w:r>
-      <w:proofErr w:type="spellEnd"/>
-      <w:r>
-        <w:rPr>
-          <w:rFonts w:ascii="Garamond" w:eastAsia="Garamond" w:hAnsi="Garamond"/>
-          <w:sz w:val="23"/>
-        </w:rPr>
-        <w:t xml:space="preserve">, </w:t>
+        <w:t xml:space="preserve">Son, Yoonseock, </w:t>
       </w:r>
       <w:proofErr w:type="spellStart"/>
       <w:r>

</xml_diff>